<commit_message>
Początkowy program do zbioru danych z chorobami serca, podrozdział o Random Forest i XGBoost
</commit_message>
<xml_diff>
--- a/praca_magisterska_Zofia_Kozłowska.docx
+++ b/praca_magisterska_Zofia_Kozłowska.docx
@@ -6650,75 +6650,1101 @@
     </w:p>
     <w:p>
       <w:pPr>
-        <w:pStyle w:val="Nagwek2"/>
-      </w:pPr>
-      <w:bookmarkStart w:id="10" w:name="_Toc222769359"/>
-      <w:proofErr w:type="spellStart"/>
-      <w:r>
-        <w:t>Random</w:t>
-      </w:r>
-      <w:proofErr w:type="spellEnd"/>
-      <w:r>
-        <w:t xml:space="preserve"> </w:t>
-      </w:r>
-      <w:proofErr w:type="spellStart"/>
-      <w:r>
-        <w:t>Forest</w:t>
-      </w:r>
-      <w:bookmarkEnd w:id="10"/>
-      <w:proofErr w:type="spellEnd"/>
-    </w:p>
-    <w:p/>
-    <w:p>
-      <w:pPr>
-        <w:pStyle w:val="Nagwek2"/>
-      </w:pPr>
-      <w:bookmarkStart w:id="11" w:name="_Toc222769360"/>
-      <w:proofErr w:type="spellStart"/>
-      <w:r>
-        <w:t>XGBoost</w:t>
-      </w:r>
-      <w:bookmarkEnd w:id="11"/>
-      <w:proofErr w:type="spellEnd"/>
-    </w:p>
-    <w:p>
-      <w:r>
-        <w:tab/>
-      </w:r>
-    </w:p>
-    <w:p>
-      <w:pPr>
-        <w:pStyle w:val="Nagwek2"/>
-      </w:pPr>
-      <w:bookmarkStart w:id="12" w:name="_Toc222769361"/>
-      <w:r>
-        <w:t>Sieci neuronowe</w:t>
-      </w:r>
-      <w:bookmarkEnd w:id="12"/>
-    </w:p>
-    <w:p/>
-    <w:p>
-      <w:pPr>
-        <w:pStyle w:val="Nagwek1"/>
-      </w:pPr>
-      <w:bookmarkStart w:id="13" w:name="_Ref222320511"/>
-      <w:bookmarkStart w:id="14" w:name="_Toc222769362"/>
-      <w:r>
-        <w:t xml:space="preserve">Analiza </w:t>
-      </w:r>
-      <w:r>
-        <w:t>metod XAI</w:t>
-      </w:r>
-      <w:bookmarkEnd w:id="13"/>
-      <w:bookmarkEnd w:id="14"/>
-    </w:p>
-    <w:p>
-      <w:pPr>
         <w:spacing w:line="360" w:lineRule="auto"/>
         <w:ind w:left="431" w:firstLine="277"/>
         <w:jc w:val="both"/>
       </w:pPr>
       <w:r>
+        <w:t xml:space="preserve">W tym rozdziale pragnę przybliżyć 3 wybrane modele klasyfikacyjne. Należą do nich: las losowy, </w:t>
+      </w:r>
+      <w:proofErr w:type="spellStart"/>
+      <w:r>
+        <w:t>XGBoost</w:t>
+      </w:r>
+      <w:proofErr w:type="spellEnd"/>
+      <w:r>
+        <w:t xml:space="preserve"> oraz sieci neuronowe. To właśnie one zostaną poddane nauce wyselekcjonowanych zbiorów danych, a następnie zinterpretowane za pomocą metod wyjaśnialnej sztucznej inteligencji omówionych w rozdziale </w:t>
+      </w:r>
+      <w:r>
+        <w:fldChar w:fldCharType="begin"/>
+      </w:r>
+      <w:r>
+        <w:instrText xml:space="preserve"> REF _Ref222320511 \r \h </w:instrText>
+      </w:r>
+      <w:r>
+        <w:instrText xml:space="preserve"> \* MERGEFORMAT </w:instrText>
+      </w:r>
+      <w:r>
+        <w:fldChar w:fldCharType="separate"/>
+      </w:r>
+      <w:r>
+        <w:t>4</w:t>
+      </w:r>
+      <w:r>
+        <w:fldChar w:fldCharType="end"/>
+      </w:r>
+      <w:r>
+        <w:t xml:space="preserve">. </w:t>
+      </w:r>
+      <w:r>
+        <w:fldChar w:fldCharType="begin"/>
+      </w:r>
+      <w:r>
+        <w:instrText xml:space="preserve"> REF _Ref222320511 \h </w:instrText>
+      </w:r>
+      <w:r>
+        <w:instrText xml:space="preserve"> \* MERGEFORMAT </w:instrText>
+      </w:r>
+      <w:r>
+        <w:fldChar w:fldCharType="separate"/>
+      </w:r>
+      <w:r>
+        <w:t xml:space="preserve">Analiza </w:t>
+      </w:r>
+      <w:r>
+        <w:t>metod XAI</w:t>
+      </w:r>
+      <w:r>
+        <w:fldChar w:fldCharType="end"/>
+      </w:r>
+      <w:r>
+        <w:t>.</w:t>
+      </w:r>
+    </w:p>
+    <w:p>
+      <w:pPr>
+        <w:pStyle w:val="Nagwek2"/>
+      </w:pPr>
+      <w:bookmarkStart w:id="10" w:name="_Toc222769359"/>
+      <w:proofErr w:type="spellStart"/>
+      <w:r>
+        <w:t>Random</w:t>
+      </w:r>
+      <w:proofErr w:type="spellEnd"/>
+      <w:r>
+        <w:t xml:space="preserve"> </w:t>
+      </w:r>
+      <w:proofErr w:type="spellStart"/>
+      <w:r>
+        <w:t>Forest</w:t>
+      </w:r>
+      <w:bookmarkEnd w:id="10"/>
+      <w:proofErr w:type="spellEnd"/>
+    </w:p>
+    <w:p>
+      <w:pPr>
+        <w:spacing w:line="360" w:lineRule="auto"/>
+        <w:ind w:left="431" w:firstLine="277"/>
+        <w:jc w:val="both"/>
+      </w:pPr>
+      <w:proofErr w:type="spellStart"/>
+      <w:r>
+        <w:t>Random</w:t>
+      </w:r>
+      <w:proofErr w:type="spellEnd"/>
+      <w:r>
+        <w:t xml:space="preserve"> </w:t>
+      </w:r>
+      <w:proofErr w:type="spellStart"/>
+      <w:r>
+        <w:t>Forest</w:t>
+      </w:r>
+      <w:proofErr w:type="spellEnd"/>
+      <w:r>
+        <w:t>, czyli las losowy</w:t>
+      </w:r>
+      <w:r>
+        <w:t>,</w:t>
+      </w:r>
+      <w:r>
+        <w:t xml:space="preserve"> to metoda polegająca na zbieraniu wyników z wielu niezależnych modeli, aby </w:t>
+      </w:r>
+      <w:r>
+        <w:t xml:space="preserve">na ich podstawie udzielić </w:t>
+      </w:r>
+      <w:r>
+        <w:t>odpowied</w:t>
+      </w:r>
+      <w:r>
+        <w:t xml:space="preserve">zi </w:t>
+      </w:r>
+      <w:r>
+        <w:t>końcow</w:t>
+      </w:r>
+      <w:r>
+        <w:t>ej</w:t>
+      </w:r>
+      <w:r>
+        <w:t xml:space="preserve">. Wykorzystuje w tym celu drzewa decyzyjne, których </w:t>
+      </w:r>
+      <w:r>
+        <w:t xml:space="preserve">przykładową </w:t>
+      </w:r>
+      <w:r>
+        <w:t xml:space="preserve">strukturę przedstawiono na </w:t>
+      </w:r>
+      <w:r>
+        <w:fldChar w:fldCharType="begin"/>
+      </w:r>
+      <w:r>
+        <w:instrText xml:space="preserve"> REF _Ref223378486 \h </w:instrText>
+      </w:r>
+      <w:r>
+        <w:fldChar w:fldCharType="separate"/>
+      </w:r>
+      <w:r>
+        <w:t xml:space="preserve">Rys. </w:t>
+      </w:r>
+      <w:r>
+        <w:rPr>
+          <w:noProof/>
+        </w:rPr>
+        <w:t>3</w:t>
+      </w:r>
+      <w:r>
+        <w:t>.</w:t>
+      </w:r>
+      <w:r>
+        <w:rPr>
+          <w:noProof/>
+        </w:rPr>
+        <w:t>1</w:t>
+      </w:r>
+      <w:r>
+        <w:fldChar w:fldCharType="end"/>
+      </w:r>
+      <w:r>
+        <w:t>. Składają się one z:</w:t>
+      </w:r>
+    </w:p>
+    <w:p>
+      <w:pPr>
+        <w:pStyle w:val="Akapitzlist"/>
+        <w:numPr>
+          <w:ilvl w:val="0"/>
+          <w:numId w:val="27"/>
+        </w:numPr>
+        <w:spacing w:line="360" w:lineRule="auto"/>
+        <w:ind w:left="1210"/>
+        <w:jc w:val="both"/>
+      </w:pPr>
+      <w:r>
+        <w:t xml:space="preserve">korzenia (ang. </w:t>
+      </w:r>
+      <w:proofErr w:type="spellStart"/>
+      <w:r>
+        <w:rPr>
+          <w:i/>
+          <w:iCs/>
+        </w:rPr>
+        <w:t>root</w:t>
+      </w:r>
+      <w:proofErr w:type="spellEnd"/>
+      <w:r>
+        <w:rPr>
+          <w:i/>
+          <w:iCs/>
+        </w:rPr>
+        <w:t xml:space="preserve"> </w:t>
+      </w:r>
+      <w:proofErr w:type="spellStart"/>
+      <w:r>
+        <w:rPr>
+          <w:i/>
+          <w:iCs/>
+        </w:rPr>
+        <w:t>node</w:t>
+      </w:r>
+      <w:proofErr w:type="spellEnd"/>
+      <w:r>
+        <w:t>) – początkowy węzeł reprezentujący cały zbiór danych wejściowych,</w:t>
+      </w:r>
+    </w:p>
+    <w:p>
+      <w:pPr>
+        <w:pStyle w:val="Akapitzlist"/>
+        <w:numPr>
+          <w:ilvl w:val="0"/>
+          <w:numId w:val="27"/>
+        </w:numPr>
+        <w:spacing w:line="360" w:lineRule="auto"/>
+        <w:ind w:left="1210"/>
+        <w:jc w:val="both"/>
+      </w:pPr>
+      <w:r>
+        <w:t>węzłów</w:t>
+      </w:r>
+      <w:r>
+        <w:t xml:space="preserve"> (ang. </w:t>
+      </w:r>
+      <w:proofErr w:type="spellStart"/>
+      <w:r>
+        <w:rPr>
+          <w:i/>
+          <w:iCs/>
+        </w:rPr>
+        <w:t>decision</w:t>
+      </w:r>
+      <w:proofErr w:type="spellEnd"/>
+      <w:r>
+        <w:rPr>
+          <w:i/>
+          <w:iCs/>
+        </w:rPr>
+        <w:t xml:space="preserve"> </w:t>
+      </w:r>
+      <w:proofErr w:type="spellStart"/>
+      <w:r>
+        <w:rPr>
+          <w:i/>
+          <w:iCs/>
+        </w:rPr>
+        <w:t>node</w:t>
+      </w:r>
+      <w:proofErr w:type="spellEnd"/>
+      <w:r>
+        <w:t>)</w:t>
+      </w:r>
+      <w:r>
+        <w:t xml:space="preserve"> – punktów, w których zachodzi </w:t>
+      </w:r>
+      <w:r>
+        <w:t>podział danych ze względu na wybraną cechę</w:t>
+      </w:r>
+      <w:r>
+        <w:t>,</w:t>
+      </w:r>
+    </w:p>
+    <w:p>
+      <w:pPr>
+        <w:pStyle w:val="Akapitzlist"/>
+        <w:numPr>
+          <w:ilvl w:val="0"/>
+          <w:numId w:val="27"/>
+        </w:numPr>
+        <w:spacing w:line="360" w:lineRule="auto"/>
+        <w:ind w:left="1210"/>
+        <w:jc w:val="both"/>
+      </w:pPr>
+      <w:r>
+        <w:t xml:space="preserve"> gałęzi – lini</w:t>
+      </w:r>
+      <w:r>
+        <w:t>i</w:t>
+      </w:r>
+      <w:r>
+        <w:t xml:space="preserve"> prowadząc</w:t>
+      </w:r>
+      <w:r>
+        <w:t>ych</w:t>
+      </w:r>
+      <w:r>
+        <w:t xml:space="preserve"> od danego węzła do kolejnego,</w:t>
+      </w:r>
+    </w:p>
+    <w:p>
+      <w:pPr>
+        <w:pStyle w:val="Akapitzlist"/>
+        <w:numPr>
+          <w:ilvl w:val="0"/>
+          <w:numId w:val="27"/>
+        </w:numPr>
+        <w:spacing w:line="360" w:lineRule="auto"/>
+        <w:jc w:val="both"/>
+      </w:pPr>
+      <w:r>
+        <w:t xml:space="preserve">liści (ang. </w:t>
+      </w:r>
+      <w:proofErr w:type="spellStart"/>
+      <w:r>
+        <w:t>leaf</w:t>
+      </w:r>
+      <w:proofErr w:type="spellEnd"/>
+      <w:r>
+        <w:t xml:space="preserve"> </w:t>
+      </w:r>
+      <w:proofErr w:type="spellStart"/>
+      <w:r>
+        <w:t>node</w:t>
+      </w:r>
+      <w:proofErr w:type="spellEnd"/>
+      <w:r>
+        <w:t xml:space="preserve">) – </w:t>
+      </w:r>
+      <w:r>
+        <w:t xml:space="preserve">miano </w:t>
+      </w:r>
+      <w:r>
+        <w:t>węzł</w:t>
+      </w:r>
+      <w:r>
+        <w:t>ów</w:t>
+      </w:r>
+      <w:r>
+        <w:t xml:space="preserve"> końcow</w:t>
+      </w:r>
+      <w:r>
+        <w:t>ych</w:t>
+      </w:r>
+      <w:r>
+        <w:t xml:space="preserve">, tworzonych jeśli kryterium stopu zostało spełnione. Na podstawie podzbioru przykładów, które do nich trafiły ustalają </w:t>
+      </w:r>
+      <w:r>
+        <w:t>wyniki klasyfikacji, bądź regresji.</w:t>
+      </w:r>
+      <w:r>
+        <w:t xml:space="preserve"> </w:t>
+      </w:r>
+    </w:p>
+    <w:p>
+      <w:pPr>
+        <w:spacing w:line="360" w:lineRule="auto"/>
+        <w:ind w:left="431"/>
+        <w:jc w:val="center"/>
+      </w:pPr>
+      <w:r>
+        <w:rPr>
+          <w:noProof/>
+        </w:rPr>
+        <w:lastRenderedPageBreak/>
+        <w:drawing>
+          <wp:inline distT="0" distB="0" distL="0" distR="0" wp14:anchorId="0BCB4937" wp14:editId="5B61BA12">
+            <wp:extent cx="3927231" cy="2547720"/>
+            <wp:effectExtent l="0" t="0" r="0" b="5080"/>
+            <wp:docPr id="1409445686" name="Obraz 1" descr="Obraz zawierający tekst, zrzut ekranu, diagram, Czcionka&#10;&#10;Zawartość wygenerowana przez AI może być niepoprawna."/>
+            <wp:cNvGraphicFramePr>
+              <a:graphicFrameLocks xmlns:a="http://schemas.openxmlformats.org/drawingml/2006/main" noChangeAspect="1"/>
+            </wp:cNvGraphicFramePr>
+            <a:graphic xmlns:a="http://schemas.openxmlformats.org/drawingml/2006/main">
+              <a:graphicData uri="http://schemas.openxmlformats.org/drawingml/2006/picture">
+                <pic:pic xmlns:pic="http://schemas.openxmlformats.org/drawingml/2006/picture">
+                  <pic:nvPicPr>
+                    <pic:cNvPr id="1409445686" name="Obraz 1" descr="Obraz zawierający tekst, zrzut ekranu, diagram, Czcionka&#10;&#10;Zawartość wygenerowana przez AI może być niepoprawna."/>
+                    <pic:cNvPicPr>
+                      <a:picLocks noChangeAspect="1" noChangeArrowheads="1"/>
+                    </pic:cNvPicPr>
+                  </pic:nvPicPr>
+                  <pic:blipFill>
+                    <a:blip r:embed="rId16">
+                      <a:extLst>
+                        <a:ext uri="{28A0092B-C50C-407E-A947-70E740481C1C}">
+                          <a14:useLocalDpi xmlns:a14="http://schemas.microsoft.com/office/drawing/2010/main" val="0"/>
+                        </a:ext>
+                      </a:extLst>
+                    </a:blip>
+                    <a:srcRect/>
+                    <a:stretch>
+                      <a:fillRect/>
+                    </a:stretch>
+                  </pic:blipFill>
+                  <pic:spPr bwMode="auto">
+                    <a:xfrm>
+                      <a:off x="0" y="0"/>
+                      <a:ext cx="3937585" cy="2554437"/>
+                    </a:xfrm>
+                    <a:prstGeom prst="rect">
+                      <a:avLst/>
+                    </a:prstGeom>
+                    <a:noFill/>
+                    <a:ln>
+                      <a:noFill/>
+                    </a:ln>
+                  </pic:spPr>
+                </pic:pic>
+              </a:graphicData>
+            </a:graphic>
+          </wp:inline>
+        </w:drawing>
+      </w:r>
+    </w:p>
+    <w:p>
+      <w:pPr>
+        <w:pStyle w:val="Podpispodzdjciem"/>
+      </w:pPr>
+      <w:bookmarkStart w:id="11" w:name="_Ref223378486"/>
+      <w:bookmarkStart w:id="12" w:name="_Ref223378481"/>
+      <w:r>
+        <w:t xml:space="preserve">Rys. </w:t>
+      </w:r>
+      <w:fldSimple w:instr=" STYLEREF 1 \s ">
+        <w:r>
+          <w:rPr>
+            <w:noProof/>
+          </w:rPr>
+          <w:t>3</w:t>
+        </w:r>
+      </w:fldSimple>
+      <w:r>
+        <w:t>.</w:t>
+      </w:r>
+      <w:fldSimple w:instr=" SEQ Rys. \* ARABIC \s 1 ">
+        <w:r>
+          <w:rPr>
+            <w:noProof/>
+          </w:rPr>
+          <w:t>1</w:t>
+        </w:r>
+      </w:fldSimple>
+      <w:bookmarkEnd w:id="11"/>
+      <w:r>
+        <w:t>. Struktura drzewa decyzyjnego [</w:t>
+      </w:r>
+      <w:proofErr w:type="spellStart"/>
+      <w:r>
+        <w:t>Dwifana</w:t>
+      </w:r>
+      <w:proofErr w:type="spellEnd"/>
+      <w:r>
+        <w:t xml:space="preserve"> </w:t>
+      </w:r>
+      <w:proofErr w:type="spellStart"/>
+      <w:r>
+        <w:t>Saputra</w:t>
+      </w:r>
+      <w:proofErr w:type="spellEnd"/>
+      <w:r>
+        <w:t xml:space="preserve">, </w:t>
+      </w:r>
+      <w:proofErr w:type="spellStart"/>
+      <w:r>
+        <w:t>Adi</w:t>
+      </w:r>
+      <w:proofErr w:type="spellEnd"/>
+      <w:r>
+        <w:t xml:space="preserve"> &amp; </w:t>
+      </w:r>
+      <w:proofErr w:type="spellStart"/>
+      <w:r>
+        <w:t>Hindarto</w:t>
+      </w:r>
+      <w:proofErr w:type="spellEnd"/>
+      <w:r>
+        <w:t xml:space="preserve">, </w:t>
+      </w:r>
+      <w:proofErr w:type="spellStart"/>
+      <w:r>
+        <w:t>Djarot</w:t>
+      </w:r>
+      <w:proofErr w:type="spellEnd"/>
+      <w:r>
+        <w:t xml:space="preserve"> &amp; </w:t>
+      </w:r>
+      <w:proofErr w:type="spellStart"/>
+      <w:r>
+        <w:t>Haryono</w:t>
+      </w:r>
+      <w:proofErr w:type="spellEnd"/>
+      <w:r>
+        <w:t xml:space="preserve">, </w:t>
+      </w:r>
+      <w:proofErr w:type="spellStart"/>
+      <w:r>
+        <w:t>Haryono</w:t>
+      </w:r>
+      <w:proofErr w:type="spellEnd"/>
+      <w:r>
+        <w:t xml:space="preserve">. (2023). </w:t>
+      </w:r>
+      <w:proofErr w:type="spellStart"/>
+      <w:r>
+        <w:t>Supervised</w:t>
+      </w:r>
+      <w:proofErr w:type="spellEnd"/>
+      <w:r>
+        <w:t xml:space="preserve"> Learning from Data </w:t>
+      </w:r>
+      <w:proofErr w:type="spellStart"/>
+      <w:r>
+        <w:t>Mining</w:t>
+      </w:r>
+      <w:proofErr w:type="spellEnd"/>
+      <w:r>
+        <w:t xml:space="preserve"> on </w:t>
+      </w:r>
+      <w:proofErr w:type="spellStart"/>
+      <w:r>
+        <w:t>Process</w:t>
+      </w:r>
+      <w:proofErr w:type="spellEnd"/>
+      <w:r>
+        <w:t xml:space="preserve"> Data </w:t>
+      </w:r>
+      <w:proofErr w:type="spellStart"/>
+      <w:r>
+        <w:t>Loggers</w:t>
+      </w:r>
+      <w:proofErr w:type="spellEnd"/>
+      <w:r>
+        <w:t xml:space="preserve"> on Micro-</w:t>
+      </w:r>
+      <w:proofErr w:type="spellStart"/>
+      <w:r>
+        <w:t>Controllers</w:t>
+      </w:r>
+      <w:proofErr w:type="spellEnd"/>
+      <w:r>
+        <w:t xml:space="preserve">. </w:t>
+      </w:r>
+      <w:proofErr w:type="spellStart"/>
+      <w:r>
+        <w:t>Sinkron</w:t>
+      </w:r>
+      <w:proofErr w:type="spellEnd"/>
+      <w:r>
+        <w:t>. 8. 157-165. 10.33395/sinkron.v8i1.11942.</w:t>
+      </w:r>
+      <w:r>
+        <w:t>]</w:t>
+      </w:r>
+      <w:bookmarkEnd w:id="12"/>
+    </w:p>
+    <w:p>
+      <w:pPr>
+        <w:spacing w:line="360" w:lineRule="auto"/>
+        <w:ind w:left="431"/>
+        <w:jc w:val="both"/>
+      </w:pPr>
+      <w:r>
+        <w:t xml:space="preserve">Budowę takiego lasu można określić jako rozszerzenie agregacji </w:t>
+      </w:r>
+      <w:proofErr w:type="spellStart"/>
+      <w:r>
+        <w:t>bootstrapowej</w:t>
+      </w:r>
+      <w:proofErr w:type="spellEnd"/>
+      <w:r>
+        <w:t xml:space="preserve"> </w:t>
+      </w:r>
+      <w:r>
+        <w:t xml:space="preserve">– </w:t>
+      </w:r>
+      <w:proofErr w:type="spellStart"/>
+      <w:r>
+        <w:t>baggingu</w:t>
+      </w:r>
+      <w:proofErr w:type="spellEnd"/>
+      <w:r>
+        <w:t>. P</w:t>
+      </w:r>
+      <w:r>
+        <w:t>roces</w:t>
+      </w:r>
+      <w:r>
+        <w:t xml:space="preserve"> ten</w:t>
+      </w:r>
+      <w:r>
+        <w:t xml:space="preserve"> </w:t>
+      </w:r>
+      <w:r>
+        <w:t>wykonuje się w celu redukcji wariancji i przeuczenia</w:t>
+      </w:r>
+      <w:r>
+        <w:t>,</w:t>
+      </w:r>
+      <w:r>
+        <w:t xml:space="preserve"> co ma zwiększać dokładność i stabilność. P</w:t>
+      </w:r>
+      <w:r>
+        <w:t>olega</w:t>
+      </w:r>
+      <w:r>
+        <w:t xml:space="preserve"> </w:t>
+      </w:r>
+      <w:r>
+        <w:t xml:space="preserve">on </w:t>
+      </w:r>
+      <w:r>
+        <w:t xml:space="preserve">na wygenerowaniu określonej liczby zestawów treningowych poprzez metodę </w:t>
+      </w:r>
+      <w:proofErr w:type="spellStart"/>
+      <w:r>
+        <w:t>bootstrap</w:t>
+      </w:r>
+      <w:proofErr w:type="spellEnd"/>
+      <w:r>
+        <w:t>, czyli losowani</w:t>
+      </w:r>
+      <w:r>
+        <w:t>e</w:t>
+      </w:r>
+      <w:r>
+        <w:t xml:space="preserve"> ze zwracaniem, niezależnym treningu </w:t>
+      </w:r>
+      <w:proofErr w:type="spellStart"/>
+      <w:r>
+        <w:t>podmodeli</w:t>
+      </w:r>
+      <w:proofErr w:type="spellEnd"/>
+      <w:r>
+        <w:t xml:space="preserve"> </w:t>
+      </w:r>
+      <w:r>
+        <w:t>na tych nowych zbiorach</w:t>
+      </w:r>
+      <w:r>
+        <w:t>, a następnie oszacowani</w:t>
+      </w:r>
+      <w:r>
+        <w:t>u</w:t>
+      </w:r>
+      <w:r>
+        <w:t xml:space="preserve"> wyników na podstawie „głosowania większościowego” (problem klasyfikacji) lub średniej (w przypadku regresji). </w:t>
+      </w:r>
+      <w:r>
+        <w:t xml:space="preserve">Rozszerzeniem będzie tutaj </w:t>
+      </w:r>
+      <w:r>
+        <w:t>losowy dobór cech, który dokonuje się przy każdym podziale w drzewie.</w:t>
+      </w:r>
+      <w:r>
+        <w:t xml:space="preserve"> Powoduje to stworzenie modelu składającego się z nieskorelowanych drzew decyzyjnych.</w:t>
+      </w:r>
+    </w:p>
+    <w:p>
+      <w:pPr>
+        <w:spacing w:line="360" w:lineRule="auto"/>
+        <w:ind w:left="431"/>
+        <w:jc w:val="both"/>
+      </w:pPr>
+      <w:r>
+        <w:tab/>
+        <w:t>Las losowy jest metodą charakteryzującą się wysoką dokładnością wyników, która potrafi poradzić sobie z</w:t>
+      </w:r>
+      <w:r>
+        <w:t xml:space="preserve"> obszernymi zbiorami danych a także występującymi w nich </w:t>
+      </w:r>
+      <w:r>
+        <w:t xml:space="preserve">wartościami brakującymi. </w:t>
+      </w:r>
+      <w:r>
+        <w:t xml:space="preserve">Niestety, duża ilość </w:t>
+      </w:r>
+      <w:proofErr w:type="spellStart"/>
+      <w:r>
+        <w:t>podmodeli</w:t>
+      </w:r>
+      <w:proofErr w:type="spellEnd"/>
+      <w:r>
+        <w:t xml:space="preserve"> sprawia, że jest ona trudna w interpretacji oraz może być czasochłonna i wymagać więcej zasobów sprzętowych, takich jak pamięć</w:t>
+      </w:r>
+      <w:r>
+        <w:t xml:space="preserve"> komputerowa</w:t>
+      </w:r>
+      <w:r>
+        <w:t>.</w:t>
+      </w:r>
+    </w:p>
+    <w:p>
+      <w:pPr>
+        <w:spacing w:line="360" w:lineRule="auto"/>
+        <w:ind w:left="431"/>
+        <w:jc w:val="both"/>
+      </w:pPr>
+    </w:p>
+    <w:p>
+      <w:pPr>
+        <w:pStyle w:val="Nagwek2"/>
+      </w:pPr>
+      <w:bookmarkStart w:id="13" w:name="_Toc222769360"/>
+      <w:proofErr w:type="spellStart"/>
+      <w:r>
+        <w:t>XGBoost</w:t>
+      </w:r>
+      <w:bookmarkEnd w:id="13"/>
+      <w:proofErr w:type="spellEnd"/>
+    </w:p>
+    <w:p>
+      <w:pPr>
+        <w:spacing w:line="360" w:lineRule="auto"/>
+        <w:ind w:left="431" w:firstLine="277"/>
+        <w:jc w:val="both"/>
+      </w:pPr>
+      <w:proofErr w:type="spellStart"/>
+      <w:r>
+        <w:t>XGBost</w:t>
+      </w:r>
+      <w:proofErr w:type="spellEnd"/>
+      <w:r>
+        <w:t xml:space="preserve"> (ang. </w:t>
+      </w:r>
+      <w:r>
+        <w:rPr>
+          <w:i/>
+          <w:iCs/>
+        </w:rPr>
+        <w:t xml:space="preserve">Extreme Gradient </w:t>
+      </w:r>
+      <w:proofErr w:type="spellStart"/>
+      <w:r>
+        <w:rPr>
+          <w:i/>
+          <w:iCs/>
+        </w:rPr>
+        <w:t>Boosting</w:t>
+      </w:r>
+      <w:proofErr w:type="spellEnd"/>
+      <w:r>
+        <w:t>) tłumaczone na polski jako ekstremalne wzmocnienie gradientowe to metoda, która podobnie jak las losowy wykorzystuje wiele mniejszych modeli</w:t>
+      </w:r>
+      <w:r>
+        <w:t>, w tym drzew decyzyjnych,</w:t>
+      </w:r>
+      <w:r>
+        <w:t xml:space="preserve"> </w:t>
+      </w:r>
+      <w:r>
+        <w:t>aby</w:t>
+      </w:r>
+      <w:r>
+        <w:t xml:space="preserve"> określ</w:t>
+      </w:r>
+      <w:r>
+        <w:t xml:space="preserve">ić </w:t>
+      </w:r>
+      <w:r>
+        <w:t>wynik</w:t>
+      </w:r>
+      <w:r>
+        <w:t>i</w:t>
+      </w:r>
+      <w:r>
+        <w:t xml:space="preserve">. </w:t>
+      </w:r>
+      <w:r>
+        <w:t>Jednak</w:t>
+      </w:r>
+      <w:r>
+        <w:t>,</w:t>
+      </w:r>
+      <w:r>
+        <w:t xml:space="preserve"> w przeciwieństwie do poprzednio omawianego sposobu</w:t>
+      </w:r>
+      <w:r>
+        <w:t>,</w:t>
+      </w:r>
+      <w:r>
+        <w:t xml:space="preserve"> działa na zasadzie </w:t>
+      </w:r>
+      <w:proofErr w:type="spellStart"/>
+      <w:r>
+        <w:t>boostingu</w:t>
+      </w:r>
+      <w:proofErr w:type="spellEnd"/>
+      <w:r>
+        <w:t xml:space="preserve">, a nie </w:t>
+      </w:r>
+      <w:proofErr w:type="spellStart"/>
+      <w:r>
+        <w:t>baggingu</w:t>
+      </w:r>
+      <w:proofErr w:type="spellEnd"/>
+      <w:r>
+        <w:t xml:space="preserve">. Proces ten polega na budowie sekwencyjnej. Każde drzewo (oprócz pierwszego) budowane jest na podstawie poprzednika </w:t>
+      </w:r>
+      <w:r>
+        <w:t xml:space="preserve">dążąc do zmniejszenia ilości błędnych założeń. </w:t>
+      </w:r>
+      <w:r>
+        <w:lastRenderedPageBreak/>
+        <w:t xml:space="preserve">Początkowe </w:t>
+      </w:r>
+      <w:proofErr w:type="spellStart"/>
+      <w:r>
+        <w:t>podmodele</w:t>
+      </w:r>
+      <w:proofErr w:type="spellEnd"/>
+      <w:r>
+        <w:t xml:space="preserve"> są słabo przystosowane do problemu z mocą predykcyjną zbliżoną, ale lekko lepszą, niż losowe przydzielanie wartości, posiadają wysoki wskaźnik błędu. Mimo to są one niezwykle istotne ze względu na </w:t>
+      </w:r>
+      <w:r>
+        <w:t>zawieranie kluczowych informacji dotyczących dzielenia zbiorów. Wraz z postępem algorytmu uczenia, czyli poprawą tych instancji</w:t>
+      </w:r>
+      <w:r>
+        <w:t xml:space="preserve"> oraz ich efektywnym połączeniem,</w:t>
+      </w:r>
+      <w:r>
+        <w:t xml:space="preserve"> wspomniane wcześniej miary zaczynają się polepszać. Kierunek, w którym ma poruszać się </w:t>
+      </w:r>
+      <w:proofErr w:type="spellStart"/>
+      <w:r>
+        <w:t>boosting</w:t>
+      </w:r>
+      <w:proofErr w:type="spellEnd"/>
+      <w:r>
+        <w:t>, czyli tworzyć nowe drzewa,</w:t>
+      </w:r>
+      <w:r>
+        <w:t xml:space="preserve"> jest wyznaczany przez gradient. W tym przypadku oznacza ono pojęcie matematyczne odnoszą</w:t>
+      </w:r>
+      <w:r>
+        <w:t>c</w:t>
+      </w:r>
+      <w:r>
+        <w:t>e</w:t>
+      </w:r>
+      <w:r>
+        <w:t xml:space="preserve"> się do </w:t>
+      </w:r>
+      <w:r>
+        <w:t>„</w:t>
+      </w:r>
+      <w:r>
+        <w:t>pol</w:t>
+      </w:r>
+      <w:r>
+        <w:t xml:space="preserve">a </w:t>
+      </w:r>
+      <w:r>
+        <w:t>wektorowe</w:t>
+      </w:r>
+      <w:r>
+        <w:t>go</w:t>
+      </w:r>
+      <w:r>
+        <w:t xml:space="preserve"> wskazujące</w:t>
+      </w:r>
+      <w:r>
+        <w:t>go</w:t>
+      </w:r>
+      <w:r>
+        <w:t xml:space="preserve"> kierunki najszybszych wzrostów wartości danego pola skalarnego w poszczególnych punktach, przy czym moduł („długość”) każdego wektora jest równy szybkości wzrostu pola skalarnego w kierunku największego wzrostu.</w:t>
+      </w:r>
+      <w:r>
+        <w:t xml:space="preserve">” </w:t>
+      </w:r>
+      <w:sdt>
+        <w:sdtPr>
+          <w:id w:val="245849763"/>
+          <w:citation/>
+        </w:sdtPr>
+        <w:sdtContent>
+          <w:r>
+            <w:fldChar w:fldCharType="begin"/>
+          </w:r>
+          <w:r>
+            <w:instrText xml:space="preserve">CITATION Wik26 \n  \l 1045 </w:instrText>
+          </w:r>
+          <w:r>
+            <w:fldChar w:fldCharType="separate"/>
+          </w:r>
+          <w:r>
+            <w:rPr>
+              <w:noProof/>
+            </w:rPr>
+            <w:t>(Wikipedia, 2026)</w:t>
+          </w:r>
+          <w:r>
+            <w:fldChar w:fldCharType="end"/>
+          </w:r>
+        </w:sdtContent>
+      </w:sdt>
+      <w:r>
+        <w:t>.</w:t>
+      </w:r>
+      <w:r>
+        <w:t xml:space="preserve"> </w:t>
+      </w:r>
+    </w:p>
+    <w:p>
+      <w:pPr>
+        <w:spacing w:line="360" w:lineRule="auto"/>
+        <w:ind w:left="431" w:firstLine="277"/>
+        <w:jc w:val="both"/>
+      </w:pPr>
+      <w:r>
+        <w:t xml:space="preserve">Kolejną różnicą względem lasów losowych jest wielkość wspomnianych drzew. W przypadku tych pierwszych powstałe </w:t>
+      </w:r>
+      <w:proofErr w:type="spellStart"/>
+      <w:r>
+        <w:t>podmodele</w:t>
+      </w:r>
+      <w:proofErr w:type="spellEnd"/>
+      <w:r>
+        <w:t xml:space="preserve"> mogą osiągać duże rozmiary z wieloma </w:t>
+      </w:r>
+      <w:proofErr w:type="spellStart"/>
+      <w:r>
+        <w:t>odgałęzieniami</w:t>
+      </w:r>
+      <w:proofErr w:type="spellEnd"/>
+      <w:r>
+        <w:t xml:space="preserve">. </w:t>
+      </w:r>
+      <w:proofErr w:type="spellStart"/>
+      <w:r>
+        <w:t>XGBoost</w:t>
+      </w:r>
+      <w:proofErr w:type="spellEnd"/>
+      <w:r>
+        <w:t xml:space="preserve"> charakteryzuje się niewielkimi</w:t>
+      </w:r>
+      <w:r>
+        <w:t xml:space="preserve"> instancjami</w:t>
+      </w:r>
+      <w:r>
+        <w:t>, które są bardziej interpretowalne.</w:t>
+      </w:r>
+      <w:r>
+        <w:t xml:space="preserve"> Dodatkowo zawiera parametry wejściowe, które możemy </w:t>
+      </w:r>
+      <w:r>
+        <w:t>dostosowywać</w:t>
+      </w:r>
+      <w:r>
+        <w:t xml:space="preserve">, takie jak: liczba drzew, ilość iteracji, tempo uczenia, głębokość drzewa; a także mechanizmy </w:t>
+      </w:r>
+      <w:proofErr w:type="spellStart"/>
+      <w:r>
+        <w:t>regularyzacji</w:t>
+      </w:r>
+      <w:proofErr w:type="spellEnd"/>
+      <w:r>
+        <w:t xml:space="preserve"> w postaci L1 (ang. </w:t>
+      </w:r>
+      <w:r>
+        <w:rPr>
+          <w:i/>
+          <w:iCs/>
+        </w:rPr>
+        <w:t xml:space="preserve">lasso </w:t>
+      </w:r>
+      <w:proofErr w:type="spellStart"/>
+      <w:r>
+        <w:rPr>
+          <w:i/>
+          <w:iCs/>
+        </w:rPr>
+        <w:t>regression</w:t>
+      </w:r>
+      <w:proofErr w:type="spellEnd"/>
+      <w:r>
+        <w:t xml:space="preserve">) oraz L2 (ang. </w:t>
+      </w:r>
+      <w:proofErr w:type="spellStart"/>
+      <w:r>
+        <w:rPr>
+          <w:i/>
+          <w:iCs/>
+        </w:rPr>
+        <w:t>ridge</w:t>
+      </w:r>
+      <w:proofErr w:type="spellEnd"/>
+      <w:r>
+        <w:rPr>
+          <w:i/>
+          <w:iCs/>
+        </w:rPr>
+        <w:t xml:space="preserve"> </w:t>
+      </w:r>
+      <w:proofErr w:type="spellStart"/>
+      <w:r>
+        <w:rPr>
+          <w:i/>
+          <w:iCs/>
+        </w:rPr>
+        <w:t>regression</w:t>
+      </w:r>
+      <w:proofErr w:type="spellEnd"/>
+      <w:r>
+        <w:t xml:space="preserve">) z </w:t>
+      </w:r>
+      <w:r>
+        <w:t xml:space="preserve">możliwością zmiany </w:t>
+      </w:r>
+      <w:r>
+        <w:t>ich współczynnik</w:t>
+      </w:r>
+      <w:r>
+        <w:t>ów.</w:t>
+      </w:r>
+      <w:r>
+        <w:t xml:space="preserve"> Należy zachować ostrożność w ich doborze, ponieważ to od nich zależeć będzie dokładność modelu, na którą składać się będzie niedouczenie sieci, bądź jej nadmierne dopasowanie do danych treningowych.</w:t>
+      </w:r>
+      <w:r>
+        <w:t xml:space="preserve"> Może nam w tym pomóc walidacja krzyżowa, która jest zazwyczaj dostępna wraz z implementacją </w:t>
+      </w:r>
+      <w:proofErr w:type="spellStart"/>
+      <w:r>
+        <w:t>XGBoost’a</w:t>
+      </w:r>
+      <w:proofErr w:type="spellEnd"/>
+      <w:r>
+        <w:t>.</w:t>
+      </w:r>
+    </w:p>
+    <w:p>
+      <w:pPr>
+        <w:spacing w:line="360" w:lineRule="auto"/>
+        <w:ind w:left="431" w:firstLine="277"/>
+        <w:jc w:val="both"/>
+      </w:pPr>
+      <w:r>
+        <w:t xml:space="preserve">Do zalet owej metody możemy zaliczyć możliwość użycia </w:t>
+      </w:r>
+      <w:proofErr w:type="spellStart"/>
+      <w:r>
+        <w:t>regularyzacji</w:t>
+      </w:r>
+      <w:proofErr w:type="spellEnd"/>
+      <w:r>
+        <w:t>, wysoką dokładność, radzenie sobie z obszernymi zbiorami danych oraz pojawiającymi się w nich brakach, czy uczenie równoległe wykorzystujące wiele rdzeni CPU. Posiada on</w:t>
+      </w:r>
+      <w:r>
+        <w:t>a</w:t>
+      </w:r>
+      <w:r>
+        <w:t xml:space="preserve"> jednak parę kluczowych </w:t>
+      </w:r>
+      <w:r>
+        <w:t>problemów</w:t>
+      </w:r>
+      <w:r>
+        <w:t xml:space="preserve">, takich jak odpowiedni dobór parametrów, duże zużycie pamięci sprzętowej, </w:t>
+      </w:r>
+      <w:r>
+        <w:t>trudności z przetwarzaniem danych kategorycznych, duży czas uczenia, czy to, że przez swoje możliwości dostrojenia jest mało przyjazn</w:t>
+      </w:r>
+      <w:r>
+        <w:t>a</w:t>
+      </w:r>
+      <w:r>
+        <w:t xml:space="preserve"> dla osób początkujących w dziedzinie sztucznej inteligencji. </w:t>
+      </w:r>
+    </w:p>
+    <w:p>
+      <w:pPr>
+        <w:pStyle w:val="Nagwek2"/>
+      </w:pPr>
+      <w:bookmarkStart w:id="14" w:name="_Toc222769361"/>
+      <w:r>
+        <w:t>Sieci neuronowe</w:t>
+      </w:r>
+      <w:bookmarkEnd w:id="14"/>
+    </w:p>
+    <w:p/>
+    <w:p>
+      <w:pPr>
+        <w:pStyle w:val="Nagwek1"/>
+      </w:pPr>
+      <w:bookmarkStart w:id="15" w:name="_Ref222320511"/>
+      <w:bookmarkStart w:id="16" w:name="_Toc222769362"/>
+      <w:r>
+        <w:t xml:space="preserve">Analiza </w:t>
+      </w:r>
+      <w:r>
+        <w:t>metod XAI</w:t>
+      </w:r>
+      <w:bookmarkEnd w:id="15"/>
+      <w:bookmarkEnd w:id="16"/>
+    </w:p>
+    <w:p>
+      <w:pPr>
+        <w:spacing w:line="360" w:lineRule="auto"/>
+        <w:ind w:left="431" w:firstLine="277"/>
+        <w:jc w:val="both"/>
+      </w:pPr>
+      <w:r>
+        <w:lastRenderedPageBreak/>
         <w:t>Interpretowalność możemy podzielić ze względu na sposób jej przeprowadzenia. Poprzez design oznacza, że wybieramy modele, które są z założenia proste i łatwe w zrozumieniu więc nie musimy stosować żadnych dodatkowych narzędzi. Post-hoc polega na tym, iż stosujemy metodę XAI po wytrenowaniu systemu. Z czego można wyróżnić sposoby niezależne od modelu albo zależne. Te pierwsze dodatkowo dzielimy na lokalne, które starają się wytłumaczyć konkretne predykcje, oraz globalne skupiające się na zbiorze danych</w:t>
       </w:r>
       <w:r>
@@ -6758,11 +7784,11 @@
       <w:pPr>
         <w:pStyle w:val="Nagwek2"/>
       </w:pPr>
-      <w:bookmarkStart w:id="15" w:name="_Toc222769363"/>
+      <w:bookmarkStart w:id="17" w:name="_Toc222769363"/>
       <w:r>
         <w:t>LIME</w:t>
       </w:r>
-      <w:bookmarkEnd w:id="15"/>
+      <w:bookmarkEnd w:id="17"/>
     </w:p>
     <w:p>
       <w:pPr>
@@ -6862,7 +7888,6 @@
       </w:r>
       <w:proofErr w:type="spellStart"/>
       <w:r>
-        <w:lastRenderedPageBreak/>
         <w:t>Guestrina</w:t>
       </w:r>
       <w:proofErr w:type="spellEnd"/>
@@ -7324,7 +8349,11 @@
         <w:t xml:space="preserve">. Problematyczne może być tutaj wybranie odpowiedniego modelu surogacyjnego oraz wielkości sąsiedztwa </w:t>
       </w:r>
       <w:r>
-        <w:t>branego pod uwagę podczas analizy próbki – zbyt duże powoduje wpływ mało istotnych elementów leżących daleko od badanej próby na wynik przewidywań</w:t>
+        <w:t xml:space="preserve">branego pod uwagę podczas analizy próbki – zbyt duże powoduje wpływ mało istotnych elementów leżących daleko od badanej próby na wynik </w:t>
+      </w:r>
+      <w:r>
+        <w:lastRenderedPageBreak/>
+        <w:t>przewidywań</w:t>
       </w:r>
       <w:r>
         <w:t>,</w:t>
@@ -7370,11 +8399,11 @@
       <w:pPr>
         <w:pStyle w:val="Nagwek2"/>
       </w:pPr>
-      <w:bookmarkStart w:id="16" w:name="_Toc222769364"/>
+      <w:bookmarkStart w:id="18" w:name="_Toc222769364"/>
       <w:r>
         <w:t>SHAP</w:t>
       </w:r>
-      <w:bookmarkEnd w:id="16"/>
+      <w:bookmarkEnd w:id="18"/>
     </w:p>
     <w:p>
       <w:pPr>
@@ -7397,11 +8426,7 @@
       </w:r>
       <w:proofErr w:type="spellEnd"/>
       <w:r>
-        <w:t xml:space="preserve"> z </w:t>
-      </w:r>
-      <w:r>
-        <w:lastRenderedPageBreak/>
-        <w:t>teorii gier. Polega to na tym, że każdą z cech</w:t>
+        <w:t xml:space="preserve"> z teorii gier. Polega to na tym, że każdą z cech</w:t>
       </w:r>
       <w:r>
         <w:t xml:space="preserve"> (lub grupy cech, np. grupę </w:t>
@@ -7978,7 +9003,11 @@
         </m:r>
       </m:oMath>
       <w:r>
-        <w:t xml:space="preserve"> oznacza atrybucję cech dla j.</w:t>
+        <w:t xml:space="preserve"> oznacza atrybucję </w:t>
+      </w:r>
+      <w:r>
+        <w:lastRenderedPageBreak/>
+        <w:t>cech dla j.</w:t>
       </w:r>
       <w:r>
         <w:t xml:space="preserve"> Przy interpretacji wartości </w:t>
@@ -8088,17 +9117,19 @@
         <w:t xml:space="preserve">druga możliwość </w:t>
       </w:r>
       <w:r>
-        <w:t xml:space="preserve">polega </w:t>
-      </w:r>
-      <w:r>
-        <w:lastRenderedPageBreak/>
-        <w:t xml:space="preserve">na mądrym doborze koalicji poprzez </w:t>
+        <w:t xml:space="preserve">polega na mądrym doborze koalicji poprzez </w:t>
       </w:r>
       <w:r>
         <w:t>permutację cech.</w:t>
       </w:r>
       <w:r>
-        <w:t xml:space="preserve"> Niestety SHAP posiada też drugą bardzo istotną wadę – można za jej pomocą tworzyć mylące interpretacje ukrywające uprzedzenia, co zmniejsza zaufanie do wyników owej metody.</w:t>
+        <w:t xml:space="preserve"> Niestety SHAP posiada też </w:t>
+      </w:r>
+      <w:r>
+        <w:t>inną</w:t>
+      </w:r>
+      <w:r>
+        <w:t xml:space="preserve"> bardzo istotną wadę – można za jej pomocą tworzyć mylące interpretacje ukrywające uprzedzenia, co zmniejsza zaufanie do wyników owej metody.</w:t>
       </w:r>
       <w:r>
         <w:t xml:space="preserve"> Może to być spowodowane istnieniem wielu wizualizacji, które są mało klarowne i trudne do zrozumienia.</w:t>
@@ -8124,11 +9155,11 @@
       <w:pPr>
         <w:pStyle w:val="Nagwek2"/>
       </w:pPr>
-      <w:bookmarkStart w:id="17" w:name="_Toc222769365"/>
+      <w:bookmarkStart w:id="19" w:name="_Toc222769365"/>
       <w:r>
         <w:t>Grad-C</w:t>
       </w:r>
-      <w:bookmarkEnd w:id="17"/>
+      <w:bookmarkEnd w:id="19"/>
       <w:r>
         <w:t>AM</w:t>
       </w:r>
@@ -8337,7 +9368,11 @@
         <w:t xml:space="preserve">Teraz skupiamy się na, którejś z warstw splotowej naszej sieci, w której znajdują się interesujące nas mapy cech. </w:t>
       </w:r>
       <w:r>
-        <w:t xml:space="preserve">Zazwyczaj powinno się używać ostatniej z nich, ponieważ zawiera ona najistotniejsze części obrazu. </w:t>
+        <w:t xml:space="preserve">Zazwyczaj powinno się używać ostatniej z nich, ponieważ zawiera ona </w:t>
+      </w:r>
+      <w:r>
+        <w:lastRenderedPageBreak/>
+        <w:t xml:space="preserve">najistotniejsze części obrazu. </w:t>
       </w:r>
       <w:r>
         <w:t xml:space="preserve">Ważymy </w:t>
@@ -8681,11 +9716,7 @@
       </w:r>
       <w:proofErr w:type="spellEnd"/>
       <w:r>
-        <w:t xml:space="preserve"> względem elementu mapy cech. Mówi on jak zmiany w elemencie wpływają na </w:t>
-      </w:r>
-      <w:r>
-        <w:lastRenderedPageBreak/>
-        <w:t xml:space="preserve">wartość </w:t>
+        <w:t xml:space="preserve"> względem elementu mapy cech. Mówi on jak zmiany w elemencie wpływają na wartość </w:t>
       </w:r>
       <w:proofErr w:type="spellStart"/>
       <w:r>
@@ -8789,7 +9820,7 @@
           <w:szCs w:val="20"/>
         </w:rPr>
       </w:pPr>
-      <w:bookmarkStart w:id="18" w:name="_Toc222769366"/>
+      <w:bookmarkStart w:id="20" w:name="_Toc222769366"/>
       <w:proofErr w:type="spellStart"/>
       <w:r>
         <w:t>Permutation</w:t>
@@ -8810,7 +9841,7 @@
       <w:r>
         <w:t>Importance</w:t>
       </w:r>
-      <w:bookmarkEnd w:id="18"/>
+      <w:bookmarkEnd w:id="20"/>
       <w:proofErr w:type="spellEnd"/>
     </w:p>
     <w:p>
@@ -8962,6 +9993,7 @@
           <w:i/>
           <w:iCs/>
         </w:rPr>
+        <w:lastRenderedPageBreak/>
         <w:t>X</w:t>
       </w:r>
       <w:r>
@@ -9472,9 +10504,8 @@
         <w:spacing w:line="360" w:lineRule="auto"/>
         <w:jc w:val="both"/>
       </w:pPr>
-      <w:bookmarkStart w:id="19" w:name="_Ref223194536"/>
-      <w:r>
-        <w:lastRenderedPageBreak/>
+      <w:bookmarkStart w:id="21" w:name="_Ref223194536"/>
+      <w:r>
         <w:t xml:space="preserve">Oceń miarę referencyjną zbioru </w:t>
       </w:r>
       <m:oMath>
@@ -9602,7 +10633,7 @@
       <w:r>
         <w:t>)</w:t>
       </w:r>
-      <w:bookmarkEnd w:id="19"/>
+      <w:bookmarkEnd w:id="21"/>
     </w:p>
     <w:p>
       <w:pPr>
@@ -9950,20 +10981,21 @@
       <w:pPr>
         <w:pStyle w:val="Nagwek1"/>
       </w:pPr>
-      <w:bookmarkStart w:id="20" w:name="_Ref222320522"/>
-      <w:bookmarkStart w:id="21" w:name="_Toc222769367"/>
+      <w:bookmarkStart w:id="22" w:name="_Ref222320522"/>
+      <w:bookmarkStart w:id="23" w:name="_Toc222769367"/>
       <w:r>
         <w:t>Analiza zbiorów danych</w:t>
       </w:r>
-      <w:bookmarkEnd w:id="20"/>
-      <w:bookmarkEnd w:id="21"/>
+      <w:bookmarkEnd w:id="22"/>
+      <w:bookmarkEnd w:id="23"/>
     </w:p>
     <w:p>
       <w:pPr>
         <w:pStyle w:val="Nagwek2"/>
       </w:pPr>
-      <w:bookmarkStart w:id="22" w:name="_Toc222769368"/>
-      <w:r>
+      <w:bookmarkStart w:id="24" w:name="_Toc222769368"/>
+      <w:r>
+        <w:lastRenderedPageBreak/>
         <w:t xml:space="preserve">UCI </w:t>
       </w:r>
       <w:proofErr w:type="spellStart"/>
@@ -9982,7 +11014,7 @@
       <w:r>
         <w:t xml:space="preserve"> Data</w:t>
       </w:r>
-      <w:bookmarkEnd w:id="22"/>
+      <w:bookmarkEnd w:id="24"/>
     </w:p>
     <w:p>
       <w:pPr>
@@ -10006,13 +11038,199 @@
         <w:jc w:val="both"/>
       </w:pPr>
       <w:r>
-        <w:t>(https://www.kaggle.com/datasets/redwankarimsony/heart-disease-data)</w:t>
-      </w:r>
-      <w:r>
-        <w:t>. Zawiera 16 kolumn. Id jest identyfikatorem pacjenta i nie jest brane pod uwagę podczas badań. Do zmiennych wejściowych należą: wiek (</w:t>
+        <w:t>(</w:t>
+      </w:r>
+      <w:hyperlink r:id="rId17" w:history="1">
+        <w:r>
+          <w:rPr>
+            <w:rStyle w:val="Hipercze"/>
+          </w:rPr>
+          <w:t>https://www.kaggle.com/datasets/redwankarimsony/heart-disease-data</w:t>
+        </w:r>
+      </w:hyperlink>
+      <w:r>
+        <w:t>)</w:t>
+      </w:r>
+      <w:r>
+        <w:t xml:space="preserve"> i został stworzony przez </w:t>
       </w:r>
       <w:proofErr w:type="spellStart"/>
       <w:r>
+        <w:t>Hungarian</w:t>
+      </w:r>
+      <w:proofErr w:type="spellEnd"/>
+      <w:r>
+        <w:t xml:space="preserve"> </w:t>
+      </w:r>
+      <w:proofErr w:type="spellStart"/>
+      <w:r>
+        <w:t>Institute</w:t>
+      </w:r>
+      <w:proofErr w:type="spellEnd"/>
+      <w:r>
+        <w:t xml:space="preserve"> of </w:t>
+      </w:r>
+      <w:proofErr w:type="spellStart"/>
+      <w:r>
+        <w:t>Cardiology</w:t>
+      </w:r>
+      <w:proofErr w:type="spellEnd"/>
+      <w:r>
+        <w:t xml:space="preserve">. </w:t>
+      </w:r>
+      <w:proofErr w:type="spellStart"/>
+      <w:r>
+        <w:t>Budapest</w:t>
+      </w:r>
+      <w:proofErr w:type="spellEnd"/>
+      <w:r>
+        <w:t xml:space="preserve">: </w:t>
+      </w:r>
+      <w:proofErr w:type="spellStart"/>
+      <w:r>
+        <w:t>Andras</w:t>
+      </w:r>
+      <w:proofErr w:type="spellEnd"/>
+      <w:r>
+        <w:t xml:space="preserve"> </w:t>
+      </w:r>
+      <w:proofErr w:type="spellStart"/>
+      <w:r>
+        <w:t>Janosi</w:t>
+      </w:r>
+      <w:proofErr w:type="spellEnd"/>
+      <w:r>
+        <w:t xml:space="preserve">, M.D., University </w:t>
+      </w:r>
+      <w:proofErr w:type="spellStart"/>
+      <w:r>
+        <w:t>Hospital</w:t>
+      </w:r>
+      <w:proofErr w:type="spellEnd"/>
+      <w:r>
+        <w:t xml:space="preserve">, Zurich, </w:t>
+      </w:r>
+      <w:proofErr w:type="spellStart"/>
+      <w:r>
+        <w:t>Switzerland</w:t>
+      </w:r>
+      <w:proofErr w:type="spellEnd"/>
+      <w:r>
+        <w:t xml:space="preserve">: William </w:t>
+      </w:r>
+      <w:proofErr w:type="spellStart"/>
+      <w:r>
+        <w:t>Steinbrunn</w:t>
+      </w:r>
+      <w:proofErr w:type="spellEnd"/>
+      <w:r>
+        <w:t xml:space="preserve">, M.D., University </w:t>
+      </w:r>
+      <w:proofErr w:type="spellStart"/>
+      <w:r>
+        <w:t>Hospital</w:t>
+      </w:r>
+      <w:proofErr w:type="spellEnd"/>
+      <w:r>
+        <w:t xml:space="preserve">, </w:t>
+      </w:r>
+      <w:proofErr w:type="spellStart"/>
+      <w:r>
+        <w:t>Basel</w:t>
+      </w:r>
+      <w:proofErr w:type="spellEnd"/>
+      <w:r>
+        <w:t xml:space="preserve">, </w:t>
+      </w:r>
+      <w:proofErr w:type="spellStart"/>
+      <w:r>
+        <w:t>Switzerland</w:t>
+      </w:r>
+      <w:proofErr w:type="spellEnd"/>
+      <w:r>
+        <w:t xml:space="preserve">: </w:t>
+      </w:r>
+      <w:proofErr w:type="spellStart"/>
+      <w:r>
+        <w:t>Matthias</w:t>
+      </w:r>
+      <w:proofErr w:type="spellEnd"/>
+      <w:r>
+        <w:t xml:space="preserve"> </w:t>
+      </w:r>
+      <w:proofErr w:type="spellStart"/>
+      <w:r>
+        <w:t>Pfisterer</w:t>
+      </w:r>
+      <w:proofErr w:type="spellEnd"/>
+      <w:r>
+        <w:t>, M.D.</w:t>
+      </w:r>
+      <w:r>
+        <w:t>, a także</w:t>
+      </w:r>
+      <w:r>
+        <w:t xml:space="preserve"> V.A. </w:t>
+      </w:r>
+      <w:proofErr w:type="spellStart"/>
+      <w:r>
+        <w:t>Medical</w:t>
+      </w:r>
+      <w:proofErr w:type="spellEnd"/>
+      <w:r>
+        <w:t xml:space="preserve"> Center, </w:t>
+      </w:r>
+      <w:proofErr w:type="spellStart"/>
+      <w:r>
+        <w:t>Long</w:t>
+      </w:r>
+      <w:proofErr w:type="spellEnd"/>
+      <w:r>
+        <w:t xml:space="preserve"> Beach and Cleveland </w:t>
+      </w:r>
+      <w:proofErr w:type="spellStart"/>
+      <w:r>
+        <w:t>Clinic</w:t>
+      </w:r>
+      <w:proofErr w:type="spellEnd"/>
+      <w:r>
+        <w:t xml:space="preserve"> </w:t>
+      </w:r>
+      <w:proofErr w:type="spellStart"/>
+      <w:r>
+        <w:t>Foundation:Robert</w:t>
+      </w:r>
+      <w:proofErr w:type="spellEnd"/>
+      <w:r>
+        <w:t xml:space="preserve"> </w:t>
+      </w:r>
+      <w:proofErr w:type="spellStart"/>
+      <w:r>
+        <w:t>Detrano</w:t>
+      </w:r>
+      <w:proofErr w:type="spellEnd"/>
+      <w:r>
+        <w:t xml:space="preserve">, M.D., </w:t>
+      </w:r>
+      <w:proofErr w:type="spellStart"/>
+      <w:r>
+        <w:t>Ph.D</w:t>
+      </w:r>
+      <w:proofErr w:type="spellEnd"/>
+      <w:r>
+        <w:t>.</w:t>
+      </w:r>
+      <w:r>
+        <w:t xml:space="preserve"> Zawiera 16 kolumn</w:t>
+      </w:r>
+      <w:r>
+        <w:t xml:space="preserve"> oraz 920 rekordów</w:t>
+      </w:r>
+      <w:r>
+        <w:t>. Id jest identyfikatorem pacjenta i nie jest brane pod uwagę podczas badań. Do zmiennych wejściowych należą: wiek (</w:t>
+      </w:r>
+      <w:proofErr w:type="spellStart"/>
+      <w:r>
         <w:t>age</w:t>
       </w:r>
       <w:proofErr w:type="spellEnd"/>
@@ -10089,11 +11307,7 @@
       </w:r>
       <w:proofErr w:type="spellEnd"/>
       <w:r>
-        <w:t xml:space="preserve">), obniżenie odcinka ST wywołane wysiłkiem fizycznym w porównaniu do spoczynku </w:t>
-      </w:r>
-      <w:r>
-        <w:lastRenderedPageBreak/>
-        <w:t>(</w:t>
+        <w:t>), obniżenie odcinka ST wywołane wysiłkiem fizycznym w porównaniu do spoczynku (</w:t>
       </w:r>
       <w:proofErr w:type="spellStart"/>
       <w:r>
@@ -10139,55 +11353,7 @@
         <w:t>”</w:t>
       </w:r>
       <w:r>
-        <w:t>, która oznacza stadium choroby serca. Może ona przyjmować jedną z 5 wartości, gdzie 0 symbolizuje brak problemów z narządem, a 4 poważne trudności. W zbiorze znajduje się wiele danych brakujących</w:t>
-      </w:r>
-      <w:r>
-        <w:t>. Najwięcej braków występuje w kolumnie ca - aż 611, co stanowi 66,41% całości.</w:t>
-      </w:r>
-      <w:r>
-        <w:t xml:space="preserve"> </w:t>
-      </w:r>
-      <w:r>
-        <w:t xml:space="preserve">Dodatkowo </w:t>
-      </w:r>
-      <w:r>
-        <w:t xml:space="preserve">istnieje duże niezbilansowanie </w:t>
-      </w:r>
-      <w:r>
-        <w:t>dotyczące</w:t>
-      </w:r>
-      <w:r>
-        <w:t xml:space="preserve"> </w:t>
-      </w:r>
-      <w:r>
-        <w:t>przynależności</w:t>
-      </w:r>
-      <w:r>
-        <w:t xml:space="preserve"> osób do konkretnych klas</w:t>
-      </w:r>
-      <w:r>
-        <w:t>.</w:t>
-      </w:r>
-      <w:r>
-        <w:t xml:space="preserve"> Oznacza to, że jest znacznie mniej przypadków zakwalifikowanych </w:t>
-      </w:r>
-      <w:r>
-        <w:t>z</w:t>
-      </w:r>
-      <w:r>
-        <w:t xml:space="preserve"> </w:t>
-      </w:r>
-      <w:r>
-        <w:t>czwartym</w:t>
-      </w:r>
-      <w:r>
-        <w:t xml:space="preserve"> stadium choroby niż osób bez </w:t>
-      </w:r>
-      <w:r>
-        <w:t>przypadłości</w:t>
-      </w:r>
-      <w:r>
-        <w:t xml:space="preserve">. </w:t>
+        <w:t xml:space="preserve">, która oznacza stadium choroby serca. Może ona przyjmować jedną z 5 wartości, gdzie 0 symbolizuje brak problemów z narządem, a 4 poważne trudności. </w:t>
       </w:r>
     </w:p>
     <w:p>
@@ -10196,22 +11362,11 @@
         <w:ind w:left="431"/>
         <w:jc w:val="both"/>
       </w:pPr>
-      <w:r>
-        <w:tab/>
-      </w:r>
-      <w:r>
-        <w:t>[OPISAĆ PRZETWORZENIE DANYCH]</w:t>
-      </w:r>
-    </w:p>
-    <w:p>
-      <w:pPr>
-        <w:ind w:left="431"/>
-        <w:jc w:val="both"/>
-      </w:pPr>
     </w:p>
     <w:p>
       <w:pPr>
         <w:keepNext/>
+        <w:jc w:val="center"/>
       </w:pPr>
       <w:r>
         <w:rPr>
@@ -10223,7 +11378,7 @@
           <w:bdr w:val="none" w:sz="0" w:space="0" w:color="auto" w:frame="1"/>
         </w:rPr>
         <w:drawing>
-          <wp:inline distT="0" distB="0" distL="0" distR="0" wp14:anchorId="4E4B659E" wp14:editId="02303D23">
+          <wp:inline distT="0" distB="0" distL="0" distR="0" wp14:anchorId="7CCC9310" wp14:editId="4F32BA22">
             <wp:extent cx="5981700" cy="1121569"/>
             <wp:effectExtent l="0" t="0" r="0" b="2540"/>
             <wp:docPr id="885865203" name="Obraz 1" descr="Obraz zawierający tekst, Czcionka, zrzut ekranu&#10;&#10;Zawartość wygenerowana przez AI może być niepoprawna."/>
@@ -10240,7 +11395,7 @@
                     </pic:cNvPicPr>
                   </pic:nvPicPr>
                   <pic:blipFill>
-                    <a:blip r:embed="rId16">
+                    <a:blip r:embed="rId18">
                       <a:extLst>
                         <a:ext uri="{28A0092B-C50C-407E-A947-70E740481C1C}">
                           <a14:useLocalDpi xmlns:a14="http://schemas.microsoft.com/office/drawing/2010/main" val="0"/>
@@ -10276,7 +11431,7 @@
       <w:pPr>
         <w:pStyle w:val="Podpispodzdjciem"/>
       </w:pPr>
-      <w:bookmarkStart w:id="23" w:name="_Toc222518576"/>
+      <w:bookmarkStart w:id="25" w:name="_Toc222518576"/>
       <w:r>
         <w:t xml:space="preserve">Rys. </w:t>
       </w:r>
@@ -10300,12 +11455,93 @@
         </w:r>
       </w:fldSimple>
       <w:r>
-        <w:t>. Wykaz 5 pierwszych rekordów zbioru.</w:t>
-      </w:r>
-      <w:r>
-        <w:t xml:space="preserve"> [źródło własne]</w:t>
-      </w:r>
-      <w:bookmarkEnd w:id="23"/>
+        <w:t>. Wykaz 5 pierwszych rekordów zbioru. [źródło własne]</w:t>
+      </w:r>
+      <w:bookmarkEnd w:id="25"/>
+    </w:p>
+    <w:p>
+      <w:pPr>
+        <w:spacing w:line="360" w:lineRule="auto"/>
+        <w:ind w:left="431"/>
+        <w:jc w:val="both"/>
+      </w:pPr>
+    </w:p>
+    <w:p>
+      <w:pPr>
+        <w:spacing w:line="360" w:lineRule="auto"/>
+        <w:ind w:left="431"/>
+        <w:jc w:val="both"/>
+      </w:pPr>
+      <w:r>
+        <w:t>W zbiorze znajduje się wiele danych brakujących</w:t>
+      </w:r>
+      <w:r>
+        <w:t>. Najwięcej braków występuje w kolumnie ca - aż 611, co stanowi 66,41% całości.</w:t>
+      </w:r>
+      <w:r>
+        <w:t xml:space="preserve"> </w:t>
+      </w:r>
+      <w:r>
+        <w:t xml:space="preserve">Dodatkowo </w:t>
+      </w:r>
+      <w:r>
+        <w:t xml:space="preserve">istnieje duże niezbilansowanie </w:t>
+      </w:r>
+      <w:r>
+        <w:t>dotyczące</w:t>
+      </w:r>
+      <w:r>
+        <w:t xml:space="preserve"> </w:t>
+      </w:r>
+      <w:r>
+        <w:t>przynależności</w:t>
+      </w:r>
+      <w:r>
+        <w:t xml:space="preserve"> osób do konkretnych klas</w:t>
+      </w:r>
+      <w:r>
+        <w:t>.</w:t>
+      </w:r>
+      <w:r>
+        <w:t xml:space="preserve"> Oznacza to, że jest znacznie mniej przypadków zakwalifikowanych </w:t>
+      </w:r>
+      <w:r>
+        <w:t>z</w:t>
+      </w:r>
+      <w:r>
+        <w:t xml:space="preserve"> </w:t>
+      </w:r>
+      <w:r>
+        <w:t>czwartym</w:t>
+      </w:r>
+      <w:r>
+        <w:t xml:space="preserve"> stadium choroby niż osób bez </w:t>
+      </w:r>
+      <w:r>
+        <w:t>przypadłości</w:t>
+      </w:r>
+      <w:r>
+        <w:t xml:space="preserve">. </w:t>
+      </w:r>
+    </w:p>
+    <w:p>
+      <w:pPr>
+        <w:spacing w:line="360" w:lineRule="auto"/>
+        <w:ind w:left="431"/>
+        <w:jc w:val="both"/>
+      </w:pPr>
+      <w:r>
+        <w:tab/>
+      </w:r>
+      <w:r>
+        <w:t>[OPISAĆ PRZETWORZENIE DANYCH]</w:t>
+      </w:r>
+    </w:p>
+    <w:p>
+      <w:pPr>
+        <w:ind w:left="431"/>
+        <w:jc w:val="both"/>
+      </w:pPr>
     </w:p>
     <w:p>
       <w:pPr>
@@ -10316,19 +11552,20 @@
       <w:pPr>
         <w:pStyle w:val="Nagwek2"/>
       </w:pPr>
-      <w:bookmarkStart w:id="24" w:name="_Toc222769369"/>
-      <w:r>
+      <w:bookmarkStart w:id="26" w:name="_Toc222769369"/>
+      <w:r>
+        <w:lastRenderedPageBreak/>
         <w:t xml:space="preserve">Cards Image </w:t>
       </w:r>
       <w:proofErr w:type="spellStart"/>
       <w:r>
         <w:t>Dataset-Classification</w:t>
       </w:r>
-      <w:bookmarkEnd w:id="24"/>
+      <w:bookmarkEnd w:id="26"/>
       <w:proofErr w:type="spellEnd"/>
     </w:p>
     <w:p>
-      <w:hyperlink r:id="rId17" w:history="1">
+      <w:hyperlink r:id="rId19" w:history="1">
         <w:r>
           <w:rPr>
             <w:rStyle w:val="Hipercze"/>
@@ -10344,7 +11581,7 @@
       <w:pPr>
         <w:pStyle w:val="Nagwek2"/>
       </w:pPr>
-      <w:bookmarkStart w:id="25" w:name="_Toc222769370"/>
+      <w:bookmarkStart w:id="27" w:name="_Toc222769370"/>
       <w:r>
         <w:t xml:space="preserve">Wine </w:t>
       </w:r>
@@ -10352,14 +11589,14 @@
       <w:r>
         <w:t>Quality</w:t>
       </w:r>
-      <w:bookmarkEnd w:id="25"/>
+      <w:bookmarkEnd w:id="27"/>
       <w:proofErr w:type="spellEnd"/>
     </w:p>
     <w:p>
       <w:pPr>
         <w:ind w:firstLine="576"/>
       </w:pPr>
-      <w:hyperlink r:id="rId18" w:history="1">
+      <w:hyperlink r:id="rId20" w:history="1">
         <w:r>
           <w:rPr>
             <w:rStyle w:val="Hipercze"/>
@@ -10375,14 +11612,14 @@
       <w:pPr>
         <w:pStyle w:val="Nagwek2"/>
       </w:pPr>
-      <w:bookmarkStart w:id="26" w:name="_Toc222769371"/>
+      <w:bookmarkStart w:id="28" w:name="_Toc222769371"/>
       <w:r>
         <w:t>Bank Marketing</w:t>
       </w:r>
-      <w:bookmarkEnd w:id="26"/>
-    </w:p>
-    <w:p>
-      <w:hyperlink r:id="rId19" w:history="1">
+      <w:bookmarkEnd w:id="28"/>
+    </w:p>
+    <w:p>
+      <w:hyperlink r:id="rId21" w:history="1">
         <w:r>
           <w:rPr>
             <w:rStyle w:val="Hipercze"/>
@@ -10398,7 +11635,7 @@
       <w:pPr>
         <w:pStyle w:val="Nagwek2"/>
       </w:pPr>
-      <w:bookmarkStart w:id="27" w:name="_Toc222769372"/>
+      <w:bookmarkStart w:id="29" w:name="_Toc222769372"/>
       <w:r>
         <w:t xml:space="preserve">Brain MRI </w:t>
       </w:r>
@@ -10414,11 +11651,11 @@
       <w:r>
         <w:t>Detection</w:t>
       </w:r>
-      <w:bookmarkEnd w:id="27"/>
+      <w:bookmarkEnd w:id="29"/>
       <w:proofErr w:type="spellEnd"/>
     </w:p>
     <w:p>
-      <w:hyperlink r:id="rId20" w:history="1">
+      <w:hyperlink r:id="rId22" w:history="1">
         <w:r>
           <w:rPr>
             <w:rStyle w:val="Hipercze"/>
@@ -10428,7 +11665,7 @@
       </w:hyperlink>
     </w:p>
     <w:p>
-      <w:hyperlink r:id="rId21" w:anchor="1.1.-Data-Set-Description" w:history="1">
+      <w:hyperlink r:id="rId23" w:anchor="1.1.-Data-Set-Description" w:history="1">
         <w:r>
           <w:rPr>
             <w:rStyle w:val="Hipercze"/>
@@ -10442,36 +11679,83 @@
       <w:pPr>
         <w:pStyle w:val="Nagwek1"/>
       </w:pPr>
-      <w:bookmarkStart w:id="28" w:name="_Ref222320541"/>
-      <w:bookmarkStart w:id="29" w:name="_Toc222769373"/>
+      <w:bookmarkStart w:id="30" w:name="_Ref222320541"/>
+      <w:bookmarkStart w:id="31" w:name="_Toc222769373"/>
       <w:r>
         <w:t>Metodyka badań</w:t>
-      </w:r>
-      <w:bookmarkEnd w:id="28"/>
-      <w:bookmarkEnd w:id="29"/>
-    </w:p>
-    <w:p/>
-    <w:p>
-      <w:pPr>
-        <w:pStyle w:val="Nagwek1"/>
-      </w:pPr>
-      <w:bookmarkStart w:id="30" w:name="_Ref222320548"/>
-      <w:bookmarkStart w:id="31" w:name="_Toc222769374"/>
-      <w:r>
-        <w:t>Eksperymenty</w:t>
       </w:r>
       <w:bookmarkEnd w:id="30"/>
       <w:bookmarkEnd w:id="31"/>
     </w:p>
+    <w:p>
+      <w:hyperlink r:id="rId24" w:history="1">
+        <w:r>
+          <w:rPr>
+            <w:rStyle w:val="Hipercze"/>
+          </w:rPr>
+          <w:t>https://lime-ml.readthedocs.io/en/latest/lime.html</w:t>
+        </w:r>
+      </w:hyperlink>
+    </w:p>
+    <w:p>
+      <w:hyperlink r:id="rId25" w:history="1">
+        <w:r>
+          <w:rPr>
+            <w:rStyle w:val="Hipercze"/>
+          </w:rPr>
+          <w:t>https://www.datacamp.com/tutorial/explainable-ai-understanding-and-trusting-machine-learning-models</w:t>
+        </w:r>
+      </w:hyperlink>
+    </w:p>
+    <w:p>
+      <w:hyperlink r:id="rId26" w:history="1">
+        <w:r>
+          <w:rPr>
+            <w:rStyle w:val="Hipercze"/>
+          </w:rPr>
+          <w:t>https://scikit-learn.org/stable/auto_examples/inspection/plot_permutation_importance.html</w:t>
+        </w:r>
+      </w:hyperlink>
+    </w:p>
+    <w:p>
+      <w:hyperlink r:id="rId27" w:history="1">
+        <w:r>
+          <w:rPr>
+            <w:rStyle w:val="Hipercze"/>
+          </w:rPr>
+          <w:t>https://scikit-learn.org/stable/modules/generated/sklearn.ensemble.RandomForestClassifier.html</w:t>
+        </w:r>
+      </w:hyperlink>
+    </w:p>
+    <w:p>
+      <w:hyperlink r:id="rId28" w:history="1">
+        <w:r>
+          <w:rPr>
+            <w:rStyle w:val="Hipercze"/>
+          </w:rPr>
+          <w:t>https://www.geeksforgeeks.org/artificial-intelligence/introduction-to-explainable-aixai-using-lime/</w:t>
+        </w:r>
+      </w:hyperlink>
+    </w:p>
+    <w:p>
+      <w:hyperlink r:id="rId29" w:history="1">
+        <w:r>
+          <w:rPr>
+            <w:rStyle w:val="Hipercze"/>
+          </w:rPr>
+          <w:t>https://shap.readthedocs.io/en/latest/</w:t>
+        </w:r>
+      </w:hyperlink>
+    </w:p>
     <w:p/>
     <w:p>
       <w:pPr>
         <w:pStyle w:val="Nagwek1"/>
       </w:pPr>
-      <w:bookmarkStart w:id="32" w:name="_Ref222320554"/>
-      <w:bookmarkStart w:id="33" w:name="_Toc222769375"/>
-      <w:r>
-        <w:t>Wyniki</w:t>
+      <w:bookmarkStart w:id="32" w:name="_Ref222320548"/>
+      <w:bookmarkStart w:id="33" w:name="_Toc222769374"/>
+      <w:r>
+        <w:t>Eksperymenty</w:t>
       </w:r>
       <w:bookmarkEnd w:id="32"/>
       <w:bookmarkEnd w:id="33"/>
@@ -10481,28 +11765,42 @@
       <w:pPr>
         <w:pStyle w:val="Nagwek1"/>
       </w:pPr>
-      <w:bookmarkStart w:id="34" w:name="_Ref222320562"/>
-      <w:bookmarkStart w:id="35" w:name="_Toc222769376"/>
-      <w:r>
-        <w:t>Wnioski i rekomendacje</w:t>
-      </w:r>
-      <w:bookmarkStart w:id="36" w:name="_Testowanie_automatyczne"/>
+      <w:bookmarkStart w:id="34" w:name="_Ref222320554"/>
+      <w:bookmarkStart w:id="35" w:name="_Toc222769375"/>
+      <w:r>
+        <w:t>Wyniki</w:t>
+      </w:r>
       <w:bookmarkEnd w:id="34"/>
       <w:bookmarkEnd w:id="35"/>
+    </w:p>
+    <w:p/>
+    <w:p>
+      <w:pPr>
+        <w:pStyle w:val="Nagwek1"/>
+      </w:pPr>
+      <w:bookmarkStart w:id="36" w:name="_Ref222320562"/>
+      <w:bookmarkStart w:id="37" w:name="_Toc222769376"/>
+      <w:r>
+        <w:lastRenderedPageBreak/>
+        <w:t>Wnioski i rekomendacje</w:t>
+      </w:r>
+      <w:bookmarkStart w:id="38" w:name="_Testowanie_automatyczne"/>
       <w:bookmarkEnd w:id="36"/>
-    </w:p>
-    <w:p/>
-    <w:p>
-      <w:pPr>
-        <w:pStyle w:val="Nagwek1"/>
-      </w:pPr>
-      <w:bookmarkStart w:id="37" w:name="_Ref222320577"/>
-      <w:bookmarkStart w:id="38" w:name="_Toc222769377"/>
-      <w:r>
-        <w:t>Podsumowanie</w:t>
-      </w:r>
       <w:bookmarkEnd w:id="37"/>
       <w:bookmarkEnd w:id="38"/>
+    </w:p>
+    <w:p/>
+    <w:p>
+      <w:pPr>
+        <w:pStyle w:val="Nagwek1"/>
+      </w:pPr>
+      <w:bookmarkStart w:id="39" w:name="_Ref222320577"/>
+      <w:bookmarkStart w:id="40" w:name="_Toc222769377"/>
+      <w:r>
+        <w:t>Podsumowanie</w:t>
+      </w:r>
+      <w:bookmarkEnd w:id="39"/>
+      <w:bookmarkEnd w:id="40"/>
     </w:p>
     <w:p>
       <w:pPr>
@@ -10540,8 +11838,8 @@
         <w:ind w:left="431" w:firstLine="277"/>
         <w:jc w:val="both"/>
         <w:sectPr>
-          <w:footerReference w:type="default" r:id="rId22"/>
-          <w:footerReference w:type="first" r:id="rId23"/>
+          <w:footerReference w:type="default" r:id="rId30"/>
+          <w:footerReference w:type="first" r:id="rId31"/>
           <w:pgSz w:w="11906" w:h="16838"/>
           <w:pgMar w:top="709" w:right="1418" w:bottom="709" w:left="1418" w:header="709" w:footer="709" w:gutter="0"/>
           <w:pgNumType w:start="1"/>
@@ -10557,7 +11855,7 @@
         <w:jc w:val="both"/>
       </w:pPr>
     </w:p>
-    <w:bookmarkStart w:id="39" w:name="_Toc222769378" w:displacedByCustomXml="next"/>
+    <w:bookmarkStart w:id="41" w:name="_Toc222769378" w:displacedByCustomXml="next"/>
     <w:sdt>
       <w:sdtPr>
         <w:rPr>
@@ -10580,7 +11878,7 @@
           <w:r>
             <w:t>Bibliografia</w:t>
           </w:r>
-          <w:bookmarkEnd w:id="39"/>
+          <w:bookmarkEnd w:id="41"/>
         </w:p>
         <w:sdt>
           <w:sdtPr>
@@ -10879,12 +12177,12 @@
       <w:pPr>
         <w:pStyle w:val="Nagwek1"/>
       </w:pPr>
-      <w:bookmarkStart w:id="40" w:name="_Toc222769379"/>
+      <w:bookmarkStart w:id="42" w:name="_Toc222769379"/>
       <w:r>
         <w:lastRenderedPageBreak/>
         <w:t>Spis rysunków</w:t>
       </w:r>
-      <w:bookmarkEnd w:id="40"/>
+      <w:bookmarkEnd w:id="42"/>
     </w:p>
     <w:p>
       <w:pPr>
@@ -11188,7 +12486,7 @@
       </w:r>
     </w:p>
     <w:sectPr>
-      <w:footerReference w:type="default" r:id="rId24"/>
+      <w:footerReference w:type="default" r:id="rId32"/>
       <w:pgSz w:w="11906" w:h="16838"/>
       <w:pgMar w:top="709" w:right="1418" w:bottom="709" w:left="1418" w:header="709" w:footer="709" w:gutter="0"/>
       <w:pgNumType w:start="1"/>
@@ -12755,6 +14053,119 @@
     </w:lvl>
   </w:abstractNum>
   <w:abstractNum w:abstractNumId="14" w15:restartNumberingAfterBreak="0">
+    <w:nsid w:val="3EE105E1"/>
+    <w:multiLevelType w:val="hybridMultilevel"/>
+    <w:tmpl w:val="7162367A"/>
+    <w:lvl w:ilvl="0" w:tplc="04150001">
+      <w:start w:val="1"/>
+      <w:numFmt w:val="bullet"/>
+      <w:lvlText w:val=""/>
+      <w:lvlJc w:val="left"/>
+      <w:pPr>
+        <w:ind w:left="1428" w:hanging="360"/>
+      </w:pPr>
+      <w:rPr>
+        <w:rFonts w:ascii="Symbol" w:hAnsi="Symbol" w:hint="default"/>
+      </w:rPr>
+    </w:lvl>
+    <w:lvl w:ilvl="1" w:tplc="04150003" w:tentative="1">
+      <w:start w:val="1"/>
+      <w:numFmt w:val="bullet"/>
+      <w:lvlText w:val="o"/>
+      <w:lvlJc w:val="left"/>
+      <w:pPr>
+        <w:ind w:left="2148" w:hanging="360"/>
+      </w:pPr>
+      <w:rPr>
+        <w:rFonts w:ascii="Courier New" w:hAnsi="Courier New" w:cs="Courier New" w:hint="default"/>
+      </w:rPr>
+    </w:lvl>
+    <w:lvl w:ilvl="2" w:tplc="04150005" w:tentative="1">
+      <w:start w:val="1"/>
+      <w:numFmt w:val="bullet"/>
+      <w:lvlText w:val=""/>
+      <w:lvlJc w:val="left"/>
+      <w:pPr>
+        <w:ind w:left="2868" w:hanging="360"/>
+      </w:pPr>
+      <w:rPr>
+        <w:rFonts w:ascii="Wingdings" w:hAnsi="Wingdings" w:hint="default"/>
+      </w:rPr>
+    </w:lvl>
+    <w:lvl w:ilvl="3" w:tplc="04150001" w:tentative="1">
+      <w:start w:val="1"/>
+      <w:numFmt w:val="bullet"/>
+      <w:lvlText w:val=""/>
+      <w:lvlJc w:val="left"/>
+      <w:pPr>
+        <w:ind w:left="3588" w:hanging="360"/>
+      </w:pPr>
+      <w:rPr>
+        <w:rFonts w:ascii="Symbol" w:hAnsi="Symbol" w:hint="default"/>
+      </w:rPr>
+    </w:lvl>
+    <w:lvl w:ilvl="4" w:tplc="04150003" w:tentative="1">
+      <w:start w:val="1"/>
+      <w:numFmt w:val="bullet"/>
+      <w:lvlText w:val="o"/>
+      <w:lvlJc w:val="left"/>
+      <w:pPr>
+        <w:ind w:left="4308" w:hanging="360"/>
+      </w:pPr>
+      <w:rPr>
+        <w:rFonts w:ascii="Courier New" w:hAnsi="Courier New" w:cs="Courier New" w:hint="default"/>
+      </w:rPr>
+    </w:lvl>
+    <w:lvl w:ilvl="5" w:tplc="04150005" w:tentative="1">
+      <w:start w:val="1"/>
+      <w:numFmt w:val="bullet"/>
+      <w:lvlText w:val=""/>
+      <w:lvlJc w:val="left"/>
+      <w:pPr>
+        <w:ind w:left="5028" w:hanging="360"/>
+      </w:pPr>
+      <w:rPr>
+        <w:rFonts w:ascii="Wingdings" w:hAnsi="Wingdings" w:hint="default"/>
+      </w:rPr>
+    </w:lvl>
+    <w:lvl w:ilvl="6" w:tplc="04150001" w:tentative="1">
+      <w:start w:val="1"/>
+      <w:numFmt w:val="bullet"/>
+      <w:lvlText w:val=""/>
+      <w:lvlJc w:val="left"/>
+      <w:pPr>
+        <w:ind w:left="5748" w:hanging="360"/>
+      </w:pPr>
+      <w:rPr>
+        <w:rFonts w:ascii="Symbol" w:hAnsi="Symbol" w:hint="default"/>
+      </w:rPr>
+    </w:lvl>
+    <w:lvl w:ilvl="7" w:tplc="04150003" w:tentative="1">
+      <w:start w:val="1"/>
+      <w:numFmt w:val="bullet"/>
+      <w:lvlText w:val="o"/>
+      <w:lvlJc w:val="left"/>
+      <w:pPr>
+        <w:ind w:left="6468" w:hanging="360"/>
+      </w:pPr>
+      <w:rPr>
+        <w:rFonts w:ascii="Courier New" w:hAnsi="Courier New" w:cs="Courier New" w:hint="default"/>
+      </w:rPr>
+    </w:lvl>
+    <w:lvl w:ilvl="8" w:tplc="04150005" w:tentative="1">
+      <w:start w:val="1"/>
+      <w:numFmt w:val="bullet"/>
+      <w:lvlText w:val=""/>
+      <w:lvlJc w:val="left"/>
+      <w:pPr>
+        <w:ind w:left="7188" w:hanging="360"/>
+      </w:pPr>
+      <w:rPr>
+        <w:rFonts w:ascii="Wingdings" w:hAnsi="Wingdings" w:hint="default"/>
+      </w:rPr>
+    </w:lvl>
+  </w:abstractNum>
+  <w:abstractNum w:abstractNumId="15" w15:restartNumberingAfterBreak="0">
     <w:nsid w:val="4896749B"/>
     <w:multiLevelType w:val="hybridMultilevel"/>
     <w:tmpl w:val="1B1EBA8C"/>
@@ -12840,7 +14251,7 @@
       </w:pPr>
     </w:lvl>
   </w:abstractNum>
-  <w:abstractNum w:abstractNumId="15" w15:restartNumberingAfterBreak="0">
+  <w:abstractNum w:abstractNumId="16" w15:restartNumberingAfterBreak="0">
     <w:nsid w:val="490B6E52"/>
     <w:multiLevelType w:val="hybridMultilevel"/>
     <w:tmpl w:val="10C472E4"/>
@@ -12953,7 +14364,7 @@
       </w:rPr>
     </w:lvl>
   </w:abstractNum>
-  <w:abstractNum w:abstractNumId="16" w15:restartNumberingAfterBreak="0">
+  <w:abstractNum w:abstractNumId="17" w15:restartNumberingAfterBreak="0">
     <w:nsid w:val="4B414FF3"/>
     <w:multiLevelType w:val="hybridMultilevel"/>
     <w:tmpl w:val="BE380074"/>
@@ -13066,7 +14477,7 @@
       </w:rPr>
     </w:lvl>
   </w:abstractNum>
-  <w:abstractNum w:abstractNumId="17" w15:restartNumberingAfterBreak="0">
+  <w:abstractNum w:abstractNumId="18" w15:restartNumberingAfterBreak="0">
     <w:nsid w:val="512365B9"/>
     <w:multiLevelType w:val="multilevel"/>
     <w:tmpl w:val="9B6603EC"/>
@@ -13158,7 +14569,7 @@
       </w:pPr>
     </w:lvl>
   </w:abstractNum>
-  <w:abstractNum w:abstractNumId="18" w15:restartNumberingAfterBreak="0">
+  <w:abstractNum w:abstractNumId="19" w15:restartNumberingAfterBreak="0">
     <w:nsid w:val="52A0195D"/>
     <w:multiLevelType w:val="hybridMultilevel"/>
     <w:tmpl w:val="BA7464A2"/>
@@ -13247,7 +14658,7 @@
       </w:pPr>
     </w:lvl>
   </w:abstractNum>
-  <w:abstractNum w:abstractNumId="19" w15:restartNumberingAfterBreak="0">
+  <w:abstractNum w:abstractNumId="20" w15:restartNumberingAfterBreak="0">
     <w:nsid w:val="54300D71"/>
     <w:multiLevelType w:val="hybridMultilevel"/>
     <w:tmpl w:val="BE2C546A"/>
@@ -13360,7 +14771,7 @@
       </w:rPr>
     </w:lvl>
   </w:abstractNum>
-  <w:abstractNum w:abstractNumId="20" w15:restartNumberingAfterBreak="0">
+  <w:abstractNum w:abstractNumId="21" w15:restartNumberingAfterBreak="0">
     <w:nsid w:val="543A7F04"/>
     <w:multiLevelType w:val="multilevel"/>
     <w:tmpl w:val="0415001F"/>
@@ -13453,7 +14864,7 @@
       </w:pPr>
     </w:lvl>
   </w:abstractNum>
-  <w:abstractNum w:abstractNumId="21" w15:restartNumberingAfterBreak="0">
+  <w:abstractNum w:abstractNumId="22" w15:restartNumberingAfterBreak="0">
     <w:nsid w:val="66546443"/>
     <w:multiLevelType w:val="multilevel"/>
     <w:tmpl w:val="0415001F"/>
@@ -13545,7 +14956,7 @@
       </w:pPr>
     </w:lvl>
   </w:abstractNum>
-  <w:abstractNum w:abstractNumId="22" w15:restartNumberingAfterBreak="0">
+  <w:abstractNum w:abstractNumId="23" w15:restartNumberingAfterBreak="0">
     <w:nsid w:val="66CD17E2"/>
     <w:multiLevelType w:val="hybridMultilevel"/>
     <w:tmpl w:val="C03E83A2"/>
@@ -13658,7 +15069,7 @@
       </w:rPr>
     </w:lvl>
   </w:abstractNum>
-  <w:abstractNum w:abstractNumId="23" w15:restartNumberingAfterBreak="0">
+  <w:abstractNum w:abstractNumId="24" w15:restartNumberingAfterBreak="0">
     <w:nsid w:val="6B8D3D3F"/>
     <w:multiLevelType w:val="multilevel"/>
     <w:tmpl w:val="3C469CA8"/>
@@ -13771,7 +15182,7 @@
       </w:rPr>
     </w:lvl>
   </w:abstractNum>
-  <w:abstractNum w:abstractNumId="24" w15:restartNumberingAfterBreak="0">
+  <w:abstractNum w:abstractNumId="25" w15:restartNumberingAfterBreak="0">
     <w:nsid w:val="7005440D"/>
     <w:multiLevelType w:val="multilevel"/>
     <w:tmpl w:val="172E9264"/>
@@ -13887,7 +15298,7 @@
       </w:rPr>
     </w:lvl>
   </w:abstractNum>
-  <w:abstractNum w:abstractNumId="25" w15:restartNumberingAfterBreak="0">
+  <w:abstractNum w:abstractNumId="26" w15:restartNumberingAfterBreak="0">
     <w:nsid w:val="7246411F"/>
     <w:multiLevelType w:val="hybridMultilevel"/>
     <w:tmpl w:val="2206AB4C"/>
@@ -13977,7 +15388,7 @@
     <w:abstractNumId w:val="9"/>
   </w:num>
   <w:num w:numId="2" w16cid:durableId="930427883">
-    <w:abstractNumId w:val="14"/>
+    <w:abstractNumId w:val="15"/>
   </w:num>
   <w:num w:numId="3" w16cid:durableId="1377896390">
     <w:abstractNumId w:val="10"/>
@@ -13986,25 +15397,25 @@
     <w:abstractNumId w:val="3"/>
   </w:num>
   <w:num w:numId="5" w16cid:durableId="720447645">
+    <w:abstractNumId w:val="19"/>
+  </w:num>
+  <w:num w:numId="6" w16cid:durableId="735318245">
+    <w:abstractNumId w:val="24"/>
+  </w:num>
+  <w:num w:numId="7" w16cid:durableId="830172391">
+    <w:abstractNumId w:val="22"/>
+  </w:num>
+  <w:num w:numId="8" w16cid:durableId="1279488490">
+    <w:abstractNumId w:val="21"/>
+  </w:num>
+  <w:num w:numId="9" w16cid:durableId="1893273952">
+    <w:abstractNumId w:val="25"/>
+  </w:num>
+  <w:num w:numId="10" w16cid:durableId="2054497445">
     <w:abstractNumId w:val="18"/>
   </w:num>
-  <w:num w:numId="6" w16cid:durableId="735318245">
-    <w:abstractNumId w:val="23"/>
-  </w:num>
-  <w:num w:numId="7" w16cid:durableId="830172391">
-    <w:abstractNumId w:val="21"/>
-  </w:num>
-  <w:num w:numId="8" w16cid:durableId="1279488490">
-    <w:abstractNumId w:val="20"/>
-  </w:num>
-  <w:num w:numId="9" w16cid:durableId="1893273952">
-    <w:abstractNumId w:val="24"/>
-  </w:num>
-  <w:num w:numId="10" w16cid:durableId="2054497445">
-    <w:abstractNumId w:val="17"/>
-  </w:num>
   <w:num w:numId="11" w16cid:durableId="1600794916">
-    <w:abstractNumId w:val="25"/>
+    <w:abstractNumId w:val="26"/>
   </w:num>
   <w:num w:numId="12" w16cid:durableId="1889416927">
     <w:abstractNumId w:val="5"/>
@@ -14019,22 +15430,22 @@
     <w:abstractNumId w:val="4"/>
   </w:num>
   <w:num w:numId="16" w16cid:durableId="738090556">
-    <w:abstractNumId w:val="22"/>
+    <w:abstractNumId w:val="23"/>
   </w:num>
   <w:num w:numId="17" w16cid:durableId="46223924">
-    <w:abstractNumId w:val="16"/>
+    <w:abstractNumId w:val="17"/>
   </w:num>
   <w:num w:numId="18" w16cid:durableId="1860006757">
     <w:abstractNumId w:val="13"/>
   </w:num>
   <w:num w:numId="19" w16cid:durableId="1140269466">
-    <w:abstractNumId w:val="19"/>
+    <w:abstractNumId w:val="20"/>
   </w:num>
   <w:num w:numId="20" w16cid:durableId="1464499950">
     <w:abstractNumId w:val="12"/>
   </w:num>
   <w:num w:numId="21" w16cid:durableId="140464638">
-    <w:abstractNumId w:val="15"/>
+    <w:abstractNumId w:val="16"/>
   </w:num>
   <w:num w:numId="22" w16cid:durableId="1356619611">
     <w:abstractNumId w:val="0"/>
@@ -14050,6 +15461,9 @@
   </w:num>
   <w:num w:numId="26" w16cid:durableId="959602761">
     <w:abstractNumId w:val="7"/>
+  </w:num>
+  <w:num w:numId="27" w16cid:durableId="1614358711">
+    <w:abstractNumId w:val="14"/>
   </w:num>
   <w:numIdMacAtCleanup w:val="11"/>
 </w:numbering>
@@ -15630,13 +17044,30 @@
       </b:Author>
     </b:Author>
     <b:Publisher>Christoph Molnar</b:Publisher>
+    <b:RefOrder>9</b:RefOrder>
+  </b:Source>
+  <b:Source>
+    <b:Tag>Wik26</b:Tag>
+    <b:SourceType>InternetSite</b:SourceType>
+    <b:Guid>{F45166DB-359D-4AF5-A4DB-7946B0B708B4}</b:Guid>
+    <b:Title>Wikipedia</b:Title>
+    <b:Year>2026</b:Year>
+    <b:Author>
+      <b:Author>
+        <b:Corporate>Wikimedia</b:Corporate>
+      </b:Author>
+    </b:Author>
+    <b:InternetSiteTitle>Wikipedia - gradient (matematyka)</b:InternetSiteTitle>
+    <b:Month>Marzec</b:Month>
+    <b:Day>3</b:Day>
+    <b:URL>https://pl.wikipedia.org/wiki/Gradient_(matematyka)</b:URL>
     <b:RefOrder>8</b:RefOrder>
   </b:Source>
 </b:Sources>
 </file>
 
 <file path=customXml/itemProps1.xml><?xml version="1.0" encoding="utf-8"?>
-<ds:datastoreItem xmlns:ds="http://schemas.openxmlformats.org/officeDocument/2006/customXml" ds:itemID="{6EBB0D17-71E4-42F7-82B6-6FFE3F765365}">
+<ds:datastoreItem xmlns:ds="http://schemas.openxmlformats.org/officeDocument/2006/customXml" ds:itemID="{1F94155D-EDA5-49D0-87EC-3010A94FDA37}">
   <ds:schemaRefs>
     <ds:schemaRef ds:uri="http://schemas.openxmlformats.org/officeDocument/2006/bibliography"/>
   </ds:schemaRefs>

</xml_diff>

<commit_message>
przestawienie się na latexa, rozszerzenie kodu do nowego zbioru - wine quality (bez dnn)
</commit_message>
<xml_diff>
--- a/praca_magisterska_Zofia_Kozłowska.docx
+++ b/praca_magisterska_Zofia_Kozłowska.docx
@@ -138,7 +138,7 @@
           <w:sz w:val="36"/>
           <w:szCs w:val="36"/>
         </w:rPr>
-        <w:t>INŻYNIERSKA</w:t>
+        <w:t>MAGISTERSKA</w:t>
       </w:r>
     </w:p>
     <w:p>
@@ -428,7 +428,7 @@
           <w:sz w:val="28"/>
           <w:szCs w:val="28"/>
         </w:rPr>
-        <w:t>dr hab. inż. prof. PB</w:t>
+        <w:t xml:space="preserve">dr hab. inż. </w:t>
       </w:r>
       <w:r>
         <w:rPr>
@@ -436,7 +436,7 @@
           <w:sz w:val="28"/>
           <w:szCs w:val="28"/>
         </w:rPr>
-        <w:t xml:space="preserve"> Małgorzata </w:t>
+        <w:t xml:space="preserve">Małgorzata </w:t>
       </w:r>
       <w:proofErr w:type="spellStart"/>
       <w:r>
@@ -448,6 +448,22 @@
         <w:t>Krętowska</w:t>
       </w:r>
       <w:proofErr w:type="spellEnd"/>
+      <w:r>
+        <w:rPr>
+          <w:rFonts w:ascii="Arial Narrow" w:hAnsi="Arial Narrow"/>
+          <w:sz w:val="28"/>
+          <w:szCs w:val="28"/>
+        </w:rPr>
+        <w:t xml:space="preserve">, </w:t>
+      </w:r>
+      <w:r>
+        <w:rPr>
+          <w:rFonts w:ascii="Arial Narrow" w:hAnsi="Arial Narrow"/>
+          <w:sz w:val="28"/>
+          <w:szCs w:val="28"/>
+        </w:rPr>
+        <w:t>prof. PB</w:t>
+      </w:r>
       <w:r>
         <w:rPr>
           <w:rFonts w:ascii="Arial Narrow" w:hAnsi="Arial Narrow"/>
@@ -6669,10 +6685,7 @@
         <w:fldChar w:fldCharType="begin"/>
       </w:r>
       <w:r>
-        <w:instrText xml:space="preserve"> REF _Ref222320511 \r \h </w:instrText>
-      </w:r>
-      <w:r>
-        <w:instrText xml:space="preserve"> \* MERGEFORMAT </w:instrText>
+        <w:instrText xml:space="preserve"> REF _Ref222320511 \r \h  \* MERGEFORMAT </w:instrText>
       </w:r>
       <w:r>
         <w:fldChar w:fldCharType="separate"/>
@@ -6690,10 +6703,7 @@
         <w:fldChar w:fldCharType="begin"/>
       </w:r>
       <w:r>
-        <w:instrText xml:space="preserve"> REF _Ref222320511 \h </w:instrText>
-      </w:r>
-      <w:r>
-        <w:instrText xml:space="preserve"> \* MERGEFORMAT </w:instrText>
+        <w:instrText xml:space="preserve"> REF _Ref222320511 \h  \* MERGEFORMAT </w:instrText>
       </w:r>
       <w:r>
         <w:fldChar w:fldCharType="separate"/>
@@ -7317,7 +7327,13 @@
         <w:t xml:space="preserve">wartościami brakującymi. </w:t>
       </w:r>
       <w:r>
-        <w:t xml:space="preserve">Niestety, duża ilość </w:t>
+        <w:t xml:space="preserve">Niestety, </w:t>
+      </w:r>
+      <w:r>
+        <w:t xml:space="preserve">aktualnie nie jest w stanie przetworzyć zmiennych kategorycznych a </w:t>
+      </w:r>
+      <w:r>
+        <w:t xml:space="preserve">duża ilość </w:t>
       </w:r>
       <w:proofErr w:type="spellStart"/>
       <w:r>
@@ -7332,6 +7348,9 @@
       </w:r>
       <w:r>
         <w:t>.</w:t>
+      </w:r>
+      <w:r>
+        <w:t xml:space="preserve"> </w:t>
       </w:r>
     </w:p>
     <w:p>
@@ -7361,7 +7380,13 @@
       </w:pPr>
       <w:proofErr w:type="spellStart"/>
       <w:r>
-        <w:t>XGBost</w:t>
+        <w:t>XGB</w:t>
+      </w:r>
+      <w:r>
+        <w:t>o</w:t>
+      </w:r>
+      <w:r>
+        <w:t>ost</w:t>
       </w:r>
       <w:proofErr w:type="spellEnd"/>
       <w:r>
@@ -7439,14 +7464,14 @@
       </w:r>
       <w:proofErr w:type="spellEnd"/>
       <w:r>
-        <w:t xml:space="preserve">. Proces ten polega na budowie sekwencyjnej. Każde drzewo (oprócz pierwszego) budowane jest na podstawie poprzednika </w:t>
-      </w:r>
-      <w:r>
-        <w:t xml:space="preserve">dążąc do zmniejszenia ilości błędnych założeń. </w:t>
+        <w:t xml:space="preserve">. Proces ten polega na budowie sekwencyjnej. Każde drzewo (oprócz pierwszego) </w:t>
       </w:r>
       <w:r>
         <w:lastRenderedPageBreak/>
-        <w:t xml:space="preserve">Początkowe </w:t>
+        <w:t xml:space="preserve">budowane jest na podstawie poprzednika </w:t>
+      </w:r>
+      <w:r>
+        <w:t xml:space="preserve">dążąc do zmniejszenia ilości błędnych założeń. Początkowe </w:t>
       </w:r>
       <w:proofErr w:type="spellStart"/>
       <w:r>
@@ -7471,10 +7496,7 @@
       </w:r>
       <w:proofErr w:type="spellEnd"/>
       <w:r>
-        <w:t>, czyli tworzyć nowe drzewa,</w:t>
-      </w:r>
-      <w:r>
-        <w:t xml:space="preserve"> jest wyznaczany przez gradient. W tym przypadku oznacza ono pojęcie matematyczne odnoszą</w:t>
+        <w:t>, czyli tworzyć nowe drzewa, jest wyznaczany przez gradient. W tym przypadku oznacza ono pojęcie matematyczne odnoszą</w:t>
       </w:r>
       <w:r>
         <w:t>c</w:t>
@@ -7702,12 +7724,24 @@
         <w:t xml:space="preserve">, takich jak odpowiedni dobór parametrów, duże zużycie pamięci sprzętowej, </w:t>
       </w:r>
       <w:r>
-        <w:t>trudności z przetwarzaniem danych kategorycznych, duży czas uczenia, czy to, że przez swoje możliwości dostrojenia jest mało przyjazn</w:t>
+        <w:t>trudności z przetwarzaniem danych kategorycznych, duży czas uczenia, czy to, że przez swoje możliwości dostr</w:t>
       </w:r>
       <w:r>
         <w:t>a</w:t>
       </w:r>
       <w:r>
+        <w:t>j</w:t>
+      </w:r>
+      <w:r>
+        <w:t>a</w:t>
+      </w:r>
+      <w:r>
+        <w:t>nia jest mało przyjazn</w:t>
+      </w:r>
+      <w:r>
+        <w:t>a</w:t>
+      </w:r>
+      <w:r>
         <w:t xml:space="preserve"> dla osób początkujących w dziedzinie sztucznej inteligencji. </w:t>
       </w:r>
     </w:p>
@@ -7721,7 +7755,13 @@
       </w:r>
       <w:bookmarkEnd w:id="14"/>
     </w:p>
-    <w:p/>
+    <w:p>
+      <w:pPr>
+        <w:spacing w:line="360" w:lineRule="auto"/>
+        <w:ind w:left="431"/>
+        <w:jc w:val="both"/>
+      </w:pPr>
+    </w:p>
     <w:p>
       <w:pPr>
         <w:pStyle w:val="Nagwek1"/>
@@ -9060,7 +9100,25 @@
       </w:r>
       <w:proofErr w:type="spellEnd"/>
       <w:r>
-        <w:t xml:space="preserve">. Zyskuje na tym podstawy pochodzące z teorii gier – równomierny rozkład wkładu w wynik końcowy pomiędzy cechy oraz otrzymane wyjaśnienia są kontrastowe. Niestety cierpi ona na długi czas wykonywania obliczeń spowodowany </w:t>
+        <w:t>. Zyskuje na tym podstawy pochodzące z teorii gier – równomierny rozkład wkładu w wynik końcowy pomiędzy cech</w:t>
+      </w:r>
+      <w:r>
+        <w:t>ami</w:t>
+      </w:r>
+      <w:r>
+        <w:t xml:space="preserve"> or</w:t>
+      </w:r>
+      <w:r>
+        <w:t>az</w:t>
+      </w:r>
+      <w:r>
+        <w:t xml:space="preserve"> </w:t>
+      </w:r>
+      <w:r>
+        <w:t xml:space="preserve">kontrastowe </w:t>
+      </w:r>
+      <w:r>
+        <w:t xml:space="preserve">wyjaśnienia. Niestety cierpi ona na długi czas wykonywania obliczeń spowodowany </w:t>
       </w:r>
       <w:r>
         <w:t>ilością różnych możliwych koalicji</w:t>
@@ -9129,7 +9187,19 @@
         <w:t>inną</w:t>
       </w:r>
       <w:r>
-        <w:t xml:space="preserve"> bardzo istotną wadę – można za jej pomocą tworzyć mylące interpretacje ukrywające uprzedzenia, co zmniejsza zaufanie do wyników owej metody.</w:t>
+        <w:t xml:space="preserve"> bardzo istotną wadę – </w:t>
+      </w:r>
+      <w:r>
+        <w:t>mogą</w:t>
+      </w:r>
+      <w:r>
+        <w:t xml:space="preserve"> za jej pomocą </w:t>
+      </w:r>
+      <w:r>
+        <w:t xml:space="preserve">powstawać </w:t>
+      </w:r>
+      <w:r>
+        <w:t>mylące interpretacje ukrywające uprzedzenia, co zmniejsza zaufanie do wyników owej metody.</w:t>
       </w:r>
       <w:r>
         <w:t xml:space="preserve"> Może to być spowodowane istnieniem wielu wizualizacji, które są mało klarowne i trudne do zrozumienia.</w:t>
@@ -9368,23 +9438,23 @@
         <w:t xml:space="preserve">Teraz skupiamy się na, którejś z warstw splotowej naszej sieci, w której znajdują się interesujące nas mapy cech. </w:t>
       </w:r>
       <w:r>
-        <w:t xml:space="preserve">Zazwyczaj powinno się używać ostatniej z nich, ponieważ zawiera ona </w:t>
+        <w:t xml:space="preserve">Zazwyczaj powinno się używać ostatniej z nich, ponieważ zawiera ona najistotniejsze części obrazu. </w:t>
+      </w:r>
+      <w:r>
+        <w:t xml:space="preserve">Ważymy </w:t>
+      </w:r>
+      <w:r>
+        <w:t xml:space="preserve">wszystkie </w:t>
+      </w:r>
+      <w:r>
+        <w:t>map</w:t>
+      </w:r>
+      <w:r>
+        <w:t xml:space="preserve">y, tak aby każdy element miał taką </w:t>
       </w:r>
       <w:r>
         <w:lastRenderedPageBreak/>
-        <w:t xml:space="preserve">najistotniejsze części obrazu. </w:t>
-      </w:r>
-      <w:r>
-        <w:t xml:space="preserve">Ważymy </w:t>
-      </w:r>
-      <w:r>
-        <w:t xml:space="preserve">wszystkie </w:t>
-      </w:r>
-      <w:r>
-        <w:t>map</w:t>
-      </w:r>
-      <w:r>
-        <w:t>y, tak aby każdy element miał taką samą wagę, a następnie je sumujemy. Powstaje w ten sposób jedna macierz, która jest nazywana „ważoną mapą cech”.</w:t>
+        <w:t>samą wagę, a następnie je sumujemy. Powstaje w ten sposób jedna macierz, która jest nazywana „ważoną mapą cech”.</w:t>
       </w:r>
       <w:r>
         <w:t xml:space="preserve"> </w:t>
@@ -9993,7 +10063,6 @@
           <w:i/>
           <w:iCs/>
         </w:rPr>
-        <w:lastRenderedPageBreak/>
         <w:t>X</w:t>
       </w:r>
       <w:r>
@@ -10041,6 +10110,7 @@
         <w:jc w:val="both"/>
       </w:pPr>
       <w:r>
+        <w:lastRenderedPageBreak/>
         <w:t>Oceń miarę referencyjną modelu oryginalnego</w:t>
       </w:r>
       <w:r>
@@ -10995,7 +11065,6 @@
       </w:pPr>
       <w:bookmarkStart w:id="24" w:name="_Toc222769368"/>
       <w:r>
-        <w:lastRenderedPageBreak/>
         <w:t xml:space="preserve">UCI </w:t>
       </w:r>
       <w:proofErr w:type="spellStart"/>
@@ -11023,6 +11092,7 @@
         <w:jc w:val="both"/>
       </w:pPr>
       <w:r>
+        <w:lastRenderedPageBreak/>
         <w:t xml:space="preserve">Pierwszym analizowany zbiór danych dotyczy występowania choroby serca oraz jej stadium. Pochodzi on ze strony </w:t>
       </w:r>
       <w:proofErr w:type="spellStart"/>
@@ -11554,7 +11624,6 @@
       </w:pPr>
       <w:bookmarkStart w:id="26" w:name="_Toc222769369"/>
       <w:r>
-        <w:lastRenderedPageBreak/>
         <w:t xml:space="preserve">Cards Image </w:t>
       </w:r>
       <w:proofErr w:type="spellStart"/>
@@ -11697,6 +11766,7 @@
         </w:r>
       </w:hyperlink>
     </w:p>
+    <w:p/>
     <w:p>
       <w:hyperlink r:id="rId25" w:history="1">
         <w:r>
@@ -11707,6 +11777,7 @@
         </w:r>
       </w:hyperlink>
     </w:p>
+    <w:p/>
     <w:p>
       <w:hyperlink r:id="rId26" w:history="1">
         <w:r>
@@ -11717,8 +11788,20 @@
         </w:r>
       </w:hyperlink>
     </w:p>
+    <w:p/>
     <w:p>
       <w:hyperlink r:id="rId27" w:history="1">
+        <w:r>
+          <w:rPr>
+            <w:rStyle w:val="Hipercze"/>
+          </w:rPr>
+          <w:t>https://scikit-learn.org/stable/modules/permutation_importance.html</w:t>
+        </w:r>
+      </w:hyperlink>
+    </w:p>
+    <w:p/>
+    <w:p>
+      <w:hyperlink r:id="rId28" w:history="1">
         <w:r>
           <w:rPr>
             <w:rStyle w:val="Hipercze"/>
@@ -11727,8 +11810,9 @@
         </w:r>
       </w:hyperlink>
     </w:p>
-    <w:p>
-      <w:hyperlink r:id="rId28" w:history="1">
+    <w:p/>
+    <w:p>
+      <w:hyperlink r:id="rId29" w:history="1">
         <w:r>
           <w:rPr>
             <w:rStyle w:val="Hipercze"/>
@@ -11737,8 +11821,9 @@
         </w:r>
       </w:hyperlink>
     </w:p>
-    <w:p>
-      <w:hyperlink r:id="rId29" w:history="1">
+    <w:p/>
+    <w:p>
+      <w:hyperlink r:id="rId30" w:history="1">
         <w:r>
           <w:rPr>
             <w:rStyle w:val="Hipercze"/>
@@ -11781,7 +11866,6 @@
       <w:bookmarkStart w:id="36" w:name="_Ref222320562"/>
       <w:bookmarkStart w:id="37" w:name="_Toc222769376"/>
       <w:r>
-        <w:lastRenderedPageBreak/>
         <w:t>Wnioski i rekomendacje</w:t>
       </w:r>
       <w:bookmarkStart w:id="38" w:name="_Testowanie_automatyczne"/>
@@ -11838,8 +11922,8 @@
         <w:ind w:left="431" w:firstLine="277"/>
         <w:jc w:val="both"/>
         <w:sectPr>
-          <w:footerReference w:type="default" r:id="rId30"/>
-          <w:footerReference w:type="first" r:id="rId31"/>
+          <w:footerReference w:type="default" r:id="rId31"/>
+          <w:footerReference w:type="first" r:id="rId32"/>
           <w:pgSz w:w="11906" w:h="16838"/>
           <w:pgMar w:top="709" w:right="1418" w:bottom="709" w:left="1418" w:header="709" w:footer="709" w:gutter="0"/>
           <w:pgNumType w:start="1"/>
@@ -12129,6 +12213,35 @@
             </w:p>
             <w:p>
               <w:pPr>
+                <w:pStyle w:val="Bibliografia"/>
+                <w:ind w:left="720" w:hanging="720"/>
+                <w:rPr>
+                  <w:noProof/>
+                </w:rPr>
+              </w:pPr>
+              <w:r>
+                <w:rPr>
+                  <w:noProof/>
+                </w:rPr>
+                <w:t xml:space="preserve">Wikimedia. (2026, Marzec 3). </w:t>
+              </w:r>
+              <w:r>
+                <w:rPr>
+                  <w:i/>
+                  <w:iCs/>
+                  <w:noProof/>
+                </w:rPr>
+                <w:t>Wikipedia</w:t>
+              </w:r>
+              <w:r>
+                <w:rPr>
+                  <w:noProof/>
+                </w:rPr>
+                <w:t>. Pobrano z lokalizacji Wikipedia - gradient (matematyka): https://pl.wikipedia.org/wiki/Gradient_(matematyka)</w:t>
+              </w:r>
+            </w:p>
+            <w:p>
+              <w:pPr>
                 <w:spacing w:line="360" w:lineRule="auto"/>
                 <w:ind w:left="283"/>
                 <w:jc w:val="both"/>
@@ -12486,7 +12599,7 @@
       </w:r>
     </w:p>
     <w:sectPr>
-      <w:footerReference w:type="default" r:id="rId32"/>
+      <w:footerReference w:type="default" r:id="rId33"/>
       <w:pgSz w:w="11906" w:h="16838"/>
       <w:pgMar w:top="709" w:right="1418" w:bottom="709" w:left="1418" w:header="709" w:footer="709" w:gutter="0"/>
       <w:pgNumType w:start="1"/>

</xml_diff>